<commit_message>
Write the README and the guides in English
The README is rewritten as a short English guide: access, install, the
three environment variables, getting the sources from the team Drive,
a first sample run, full runs, outputs, rules and troubleshooting.
The generation pipeline standard, the retention rules, the known
limitations guide and the vendored schema note are translated with
their structure and numbering kept. The operator reference that was in
the README (exit codes, refusals, locks, leftovers) moves to the
standard as section 11. The renderer of the standard's section 8 now
emits English, and the block is re-rendered.
</commit_message>
<xml_diff>
--- a/docs/manual/viewer_manual.docx
+++ b/docs/manual/viewer_manual.docx
@@ -7,7 +7,7 @@
         <w:pStyle w:val="Title"/>
       </w:pPr>
       <w:r>
-        <w:t xml:space="preserve">SOMA Small/Large 뷰어 사용 매뉴얼</w:t>
+        <w:t xml:space="preserve">SOMA Small/Large Viewer — User Manual</w:t>
       </w:r>
     </w:p>
     <w:p>
@@ -15,7 +15,7 @@
         <w:pStyle w:val="Subtitle"/>
       </w:pPr>
       <w:r>
-        <w:t xml:space="preserve">인터랙티브 SMPL 인체 + IMU 뷰어 · 내부 전용(INTERNAL ONLY)</w:t>
+        <w:t xml:space="preserve">Interactive SMPL body + IMU viewer · INTERNAL ONLY</w:t>
       </w:r>
     </w:p>
     <w:p>
@@ -39,7 +39,7 @@
             <w:pStyle w:val="TOCHeading"/>
           </w:pPr>
           <w:r>
-            <w:t xml:space="preserve">목차</w:t>
+            <w:t xml:space="preserve">Table of contents</w:t>
           </w:r>
         </w:p>
         <w:p>
@@ -52,13 +52,13 @@
         </w:p>
       </w:sdtContent>
     </w:sdt>
-    <w:bookmarkStart w:id="913" w:name="개요"/>
+    <w:bookmarkStart w:id="913" w:name="overview"/>
     <w:p>
       <w:pPr>
         <w:pStyle w:val="Heading1"/>
       </w:pPr>
       <w:r>
-        <w:t xml:space="preserve">1. 개요</w:t>
+        <w:t xml:space="preserve">1. Overview</w:t>
       </w:r>
     </w:p>
     <w:p>
@@ -67,7 +67,7 @@
         <w:ind w:firstLine="360"/>
       </w:pPr>
       <w:r>
-        <w:t xml:space="preserve">이 뷰어는 PRISM 모션캡처의</w:t>
+        <w:t xml:space="preserve">This viewer shows, interactively inside Blender, the subject’s</w:t>
       </w:r>
       <w:r>
         <w:t xml:space="preserve"> </w:t>
@@ -77,13 +77,13 @@
           <w:b/>
           <w:bCs/>
         </w:rPr>
-        <w:t xml:space="preserve">small / large / anthro</w:t>
-      </w:r>
-      <w:r>
-        <w:t xml:space="preserve"> </w:t>
-      </w:r>
-      <w:r>
-        <w:t xml:space="preserve">참조 데이터로 재구성한 피험자의</w:t>
+        <w:t xml:space="preserve">real-shape SMPL body mesh</w:t>
+      </w:r>
+      <w:r>
+        <w:t xml:space="preserve"> </w:t>
+      </w:r>
+      <w:r>
+        <w:t xml:space="preserve">and the</w:t>
       </w:r>
       <w:r>
         <w:t xml:space="preserve"> </w:t>
@@ -93,10 +93,10 @@
           <w:b/>
           <w:bCs/>
         </w:rPr>
-        <w:t xml:space="preserve">실제 체형 SMPL 인체 메시</w:t>
-      </w:r>
-      <w:r>
-        <w:t xml:space="preserve">와</w:t>
+        <w:t xml:space="preserve">RGB sensor axes at the 8 IMU locations</w:t>
+      </w:r>
+      <w:r>
+        <w:t xml:space="preserve">, reconstructed from the PRISM</w:t>
       </w:r>
       <w:r>
         <w:t xml:space="preserve"> </w:t>
@@ -106,16 +106,13 @@
           <w:b/>
           <w:bCs/>
         </w:rPr>
-        <w:t xml:space="preserve">8개 IMU 위치의 RGB 센서 축</w:t>
-      </w:r>
-      <w:r>
-        <w:t xml:space="preserve">을 Blender 안에서 인터랙티브하게</w:t>
-      </w:r>
-      <w:r>
-        <w:t xml:space="preserve"> </w:t>
-      </w:r>
-      <w:r>
-        <w:t xml:space="preserve">보여준다. 영상(mp4)이 아니라</w:t>
+        <w:t xml:space="preserve">small / large / anthro</w:t>
+      </w:r>
+      <w:r>
+        <w:t xml:space="preserve"> </w:t>
+      </w:r>
+      <w:r>
+        <w:t xml:space="preserve">reference data. It is not a video (mp4) but a 3D scene you can</w:t>
       </w:r>
       <w:r>
         <w:t xml:space="preserve"> </w:t>
@@ -125,16 +122,16 @@
           <w:b/>
           <w:bCs/>
         </w:rPr>
-        <w:t xml:space="preserve">돌려보고 재생·스크럽</w:t>
-      </w:r>
-      <w:r>
-        <w:t xml:space="preserve">할 수 있는 3D 장면이며, 여기에 두 가지</w:t>
-      </w:r>
-      <w:r>
-        <w:t xml:space="preserve"> </w:t>
-      </w:r>
-      <w:r>
-        <w:t xml:space="preserve">분석 기능(데이터 run 전환, IMU별 신호 라이브 플롯)이 얹혀 있다.</w:t>
+        <w:t xml:space="preserve">orbit, play, and scrub</w:t>
+      </w:r>
+      <w:r>
+        <w:t xml:space="preserve">, with two analysis features on top (dataset-run switching and per-IMU</w:t>
+      </w:r>
+      <w:r>
+        <w:t xml:space="preserve"> </w:t>
+      </w:r>
+      <w:r>
+        <w:t xml:space="preserve">live signal plots).</w:t>
       </w:r>
     </w:p>
     <w:p>
@@ -147,7 +144,7 @@
           <wp:inline>
             <wp:extent cx="1519707" cy="2485622"/>
             <wp:effectExtent b="0" l="0" r="0" t="0"/>
-            <wp:docPr descr="뷰어 화면 — 피험자 SMPL 인체 + 8개 IMU RGB 축(X=빨강, Y=초록, Z=파랑)." title="" id="911" name="Picture"/>
+            <wp:docPr descr="The viewer — subject SMPL body + the 8 IMU RGB axes (X=red, Y=green, Z=blue)." title="" id="911" name="Picture"/>
             <a:graphic>
               <a:graphicData uri="http://schemas.openxmlformats.org/drawingml/2006/picture">
                 <pic:pic>
@@ -191,7 +188,7 @@
         <w:jc w:val="center"/>
       </w:pPr>
       <w:r>
-        <w:t xml:space="preserve">뷰어 화면 — 피험자 SMPL 인체 + 8개 IMU RGB 축(X=빨강, Y=초록, Z=파랑).</w:t>
+        <w:t xml:space="preserve">The viewer — subject SMPL body + the 8 IMU RGB axes (X=red, Y=green, Z=blue).</w:t>
       </w:r>
     </w:p>
     <w:p>
@@ -207,10 +204,10 @@
           <w:b/>
           <w:bCs/>
         </w:rPr>
-        <w:t xml:space="preserve">체형</w:t>
-      </w:r>
-      <w:r>
-        <w:t xml:space="preserve">: 피험자 실제 SMPL betas로 만든 정확한 메시.</w:t>
+        <w:t xml:space="preserve">Shape</w:t>
+      </w:r>
+      <w:r>
+        <w:t xml:space="preserve">: an exact mesh built from the subject’s own SMPL betas.</w:t>
       </w:r>
     </w:p>
     <w:p>
@@ -226,10 +223,13 @@
           <w:b/>
           <w:bCs/>
         </w:rPr>
-        <w:t xml:space="preserve">IMU 8곳</w:t>
-      </w:r>
-      <w:r>
-        <w:t xml:space="preserve">(센서 코드):</w:t>
+        <w:t xml:space="preserve">8 IMU sites</w:t>
+      </w:r>
+      <w:r>
+        <w:t xml:space="preserve"> </w:t>
+      </w:r>
+      <w:r>
+        <w:t xml:space="preserve">(sensor codes):</w:t>
       </w:r>
       <w:r>
         <w:t xml:space="preserve"> </w:t>
@@ -241,7 +241,10 @@
         <w:t xml:space="preserve">back_T4</w:t>
       </w:r>
       <w:r>
-        <w:t xml:space="preserve">(등·상부 흉추) ·</w:t>
+        <w:t xml:space="preserve"> </w:t>
+      </w:r>
+      <w:r>
+        <w:t xml:space="preserve">(upper thoracic back) ·</w:t>
       </w:r>
       <w:r>
         <w:t xml:space="preserve"> </w:t>
@@ -253,7 +256,10 @@
         <w:t xml:space="preserve">occiput</w:t>
       </w:r>
       <w:r>
-        <w:t xml:space="preserve">(후두부) ·</w:t>
+        <w:t xml:space="preserve"> </w:t>
+      </w:r>
+      <w:r>
+        <w:t xml:space="preserve">(back of head) ·</w:t>
       </w:r>
       <w:r>
         <w:t xml:space="preserve"> </w:t>
@@ -274,7 +280,10 @@
         <w:t xml:space="preserve">wrist_r</w:t>
       </w:r>
       <w:r>
-        <w:t xml:space="preserve">(손목) ·</w:t>
+        <w:t xml:space="preserve"> </w:t>
+      </w:r>
+      <w:r>
+        <w:t xml:space="preserve">·</w:t>
       </w:r>
       <w:r>
         <w:t xml:space="preserve"> </w:t>
@@ -295,7 +304,10 @@
         <w:t xml:space="preserve">shank_r</w:t>
       </w:r>
       <w:r>
-        <w:t xml:space="preserve">(정강이) ·</w:t>
+        <w:t xml:space="preserve"> </w:t>
+      </w:r>
+      <w:r>
+        <w:t xml:space="preserve">·</w:t>
       </w:r>
       <w:r>
         <w:t xml:space="preserve"> </w:t>
@@ -316,7 +328,10 @@
         <w:t xml:space="preserve">foot_r</w:t>
       </w:r>
       <w:r>
-        <w:t xml:space="preserve">(발·인솔).</w:t>
+        <w:t xml:space="preserve"> </w:t>
+      </w:r>
+      <w:r>
+        <w:t xml:space="preserve">(insole).</w:t>
       </w:r>
     </w:p>
     <w:p>
@@ -332,10 +347,10 @@
           <w:b/>
           <w:bCs/>
         </w:rPr>
-        <w:t xml:space="preserve">축 규약</w:t>
-      </w:r>
-      <w:r>
-        <w:t xml:space="preserve">: X=빨강, Y=초록, Z=파랑 (컴퓨터비전 표준 좌표계,</w:t>
+        <w:t xml:space="preserve">Axis convention</w:t>
+      </w:r>
+      <w:r>
+        <w:t xml:space="preserve">: X=red, Y=green, Z=blue (computer-vision standard frame,</w:t>
       </w:r>
       <w:r>
         <w:t xml:space="preserve"> </w:t>
@@ -350,17 +365,17 @@
         <w:t xml:space="preserve"> </w:t>
       </w:r>
       <w:r>
-        <w:t xml:space="preserve">스펙).</w:t>
+        <w:t xml:space="preserve">spec).</w:t>
       </w:r>
     </w:p>
     <w:bookmarkEnd w:id="913"/>
-    <w:bookmarkStart w:id="914" w:name="실행-방법-설치-불필요"/>
+    <w:bookmarkStart w:id="914" w:name="how-to-run-no-installation"/>
     <w:p>
       <w:pPr>
         <w:pStyle w:val="Heading1"/>
       </w:pPr>
       <w:r>
-        <w:t xml:space="preserve">2. 실행 방법 (설치 불필요)</w:t>
+        <w:t xml:space="preserve">2. How to run (no installation)</w:t>
       </w:r>
     </w:p>
     <w:p>
@@ -369,7 +384,7 @@
         <w:ind w:firstLine="360"/>
       </w:pPr>
       <w:r>
-        <w:t xml:space="preserve">이 뷰어는</w:t>
+        <w:t xml:space="preserve">This viewer is</w:t>
       </w:r>
       <w:r>
         <w:t xml:space="preserve"> </w:t>
@@ -379,10 +394,10 @@
           <w:b/>
           <w:bCs/>
         </w:rPr>
-        <w:t xml:space="preserve">Windows 전용</w:t>
-      </w:r>
-      <w:r>
-        <w:t xml:space="preserve">이다.</w:t>
+        <w:t xml:space="preserve">Windows only</w:t>
+      </w:r>
+      <w:r>
+        <w:t xml:space="preserve">.</w:t>
       </w:r>
     </w:p>
     <w:p>
@@ -394,7 +409,7 @@
         </w:numPr>
       </w:pPr>
       <w:r>
-        <w:t xml:space="preserve">배포 폴더에서</w:t>
+        <w:t xml:space="preserve">Double-click</w:t>
       </w:r>
       <w:r>
         <w:t xml:space="preserve"> </w:t>
@@ -406,7 +421,10 @@
         <w:t xml:space="preserve">launch.exe</w:t>
       </w:r>
       <w:r>
-        <w:t xml:space="preserve">를 더블클릭한다.</w:t>
+        <w:t xml:space="preserve"> </w:t>
+      </w:r>
+      <w:r>
+        <w:t xml:space="preserve">in the distribution folder.</w:t>
       </w:r>
     </w:p>
     <w:p>
@@ -418,29 +436,23 @@
         </w:numPr>
       </w:pPr>
       <w:r>
-        <w:t xml:space="preserve">이 PC에</w:t>
-      </w:r>
-      <w:r>
-        <w:t xml:space="preserve"> </w:t>
-      </w:r>
-      <w:r>
         <w:rPr>
           <w:b/>
           <w:bCs/>
         </w:rPr>
-        <w:t xml:space="preserve">Python · Blender · 애드온을 설치할 필요가 없다.</w:t>
-      </w:r>
-      <w:r>
-        <w:t xml:space="preserve"> </w:t>
-      </w:r>
-      <w:r>
-        <w:t xml:space="preserve">Blender·스크립트·플롯 라이브러리가</w:t>
-      </w:r>
-      <w:r>
-        <w:t xml:space="preserve"> </w:t>
-      </w:r>
-      <w:r>
-        <w:t xml:space="preserve">모두 폴더 안에 들어 있다. 데이터는 이 PC의 번들에서 읽으므로</w:t>
+        <w:t xml:space="preserve">No Python, Blender, or add-on needs to be installed</w:t>
+      </w:r>
+      <w:r>
+        <w:t xml:space="preserve"> </w:t>
+      </w:r>
+      <w:r>
+        <w:t xml:space="preserve">on this PC — Blender, the scripts and the</w:t>
+      </w:r>
+      <w:r>
+        <w:t xml:space="preserve"> </w:t>
+      </w:r>
+      <w:r>
+        <w:t xml:space="preserve">plotting library are all inside the folder. The data is read from this PC’s bundles, so set</w:t>
       </w:r>
       <w:r>
         <w:t xml:space="preserve"> </w:t>
@@ -452,13 +464,22 @@
         <w:t xml:space="preserve">SOMA_DATA_ROOT</w:t>
       </w:r>
       <w:r>
-        <w:t xml:space="preserve">를 설정해 둔다</w:t>
-      </w:r>
-      <w:r>
-        <w:t xml:space="preserve"> </w:t>
-      </w:r>
-      <w:r>
-        <w:t xml:space="preserve">(아래 「데이터 위치와 새 run 추가」).</w:t>
+        <w:t xml:space="preserve"> </w:t>
+      </w:r>
+      <w:r>
+        <w:t xml:space="preserve">first (see</w:t>
+      </w:r>
+      <w:r>
+        <w:t xml:space="preserve"> </w:t>
+      </w:r>
+      <w:r>
+        <w:t xml:space="preserve">“Data location and adding runs”</w:t>
+      </w:r>
+      <w:r>
+        <w:t xml:space="preserve"> </w:t>
+      </w:r>
+      <w:r>
+        <w:t xml:space="preserve">below).</w:t>
       </w:r>
     </w:p>
     <w:p>
@@ -470,17 +491,17 @@
         </w:numPr>
       </w:pPr>
       <w:r>
-        <w:t xml:space="preserve">첫 실행 시 Blender 스플래시가 잠깐 뜬 뒤 장면이 로드된다.</w:t>
+        <w:t xml:space="preserve">On first launch the Blender splash appears briefly, then the scene loads.</w:t>
       </w:r>
     </w:p>
     <w:bookmarkEnd w:id="914"/>
-    <w:bookmarkStart w:id="918" w:name="화면과-기본-조작"/>
+    <w:bookmarkStart w:id="918" w:name="screen-and-basic-controls"/>
     <w:p>
       <w:pPr>
         <w:pStyle w:val="Heading1"/>
       </w:pPr>
       <w:r>
-        <w:t xml:space="preserve">3. 화면과 기본 조작</w:t>
+        <w:t xml:space="preserve">3. Screen and basic controls</w:t>
       </w:r>
     </w:p>
     <w:p>
@@ -489,7 +510,7 @@
         <w:ind w:firstLine="360"/>
       </w:pPr>
       <w:r>
-        <w:t xml:space="preserve">3D 뷰포트에서:</w:t>
+        <w:t xml:space="preserve">In the 3D viewport:</w:t>
       </w:r>
     </w:p>
     <w:tbl>
@@ -514,7 +535,7 @@
               <w:pStyle w:val="Compact"/>
             </w:pPr>
             <w:r>
-              <w:t xml:space="preserve">조작</w:t>
+              <w:t xml:space="preserve">Action</w:t>
             </w:r>
           </w:p>
         </w:tc>
@@ -525,7 +546,7 @@
               <w:pStyle w:val="Compact"/>
             </w:pPr>
             <w:r>
-              <w:t xml:space="preserve">키/마우스</w:t>
+              <w:t xml:space="preserve">Key / mouse</w:t>
             </w:r>
           </w:p>
         </w:tc>
@@ -538,7 +559,7 @@
               <w:pStyle w:val="Compact"/>
             </w:pPr>
             <w:r>
-              <w:t xml:space="preserve">재생 / 정지</w:t>
+              <w:t xml:space="preserve">Play / pause</w:t>
             </w:r>
           </w:p>
         </w:tc>
@@ -566,7 +587,7 @@
               <w:pStyle w:val="Compact"/>
             </w:pPr>
             <w:r>
-              <w:t xml:space="preserve">궤도 회전</w:t>
+              <w:t xml:space="preserve">Orbit</w:t>
             </w:r>
           </w:p>
         </w:tc>
@@ -577,17 +598,11 @@
               <w:pStyle w:val="Compact"/>
             </w:pPr>
             <w:r>
-              <w:t xml:space="preserve">마우스</w:t>
-            </w:r>
-            <w:r>
-              <w:t xml:space="preserve"> </w:t>
-            </w:r>
-            <w:r>
               <w:rPr>
                 <w:b/>
                 <w:bCs/>
               </w:rPr>
-              <w:t xml:space="preserve">가운데 버튼 드래그</w:t>
+              <w:t xml:space="preserve">middle-mouse drag</w:t>
             </w:r>
           </w:p>
         </w:tc>
@@ -600,7 +615,7 @@
               <w:pStyle w:val="Compact"/>
             </w:pPr>
             <w:r>
-              <w:t xml:space="preserve">확대 / 축소</w:t>
+              <w:t xml:space="preserve">Zoom</w:t>
             </w:r>
           </w:p>
         </w:tc>
@@ -611,17 +626,11 @@
               <w:pStyle w:val="Compact"/>
             </w:pPr>
             <w:r>
-              <w:t xml:space="preserve">마우스</w:t>
-            </w:r>
-            <w:r>
-              <w:t xml:space="preserve"> </w:t>
-            </w:r>
-            <w:r>
               <w:rPr>
                 <w:b/>
                 <w:bCs/>
               </w:rPr>
-              <w:t xml:space="preserve">휠</w:t>
+              <w:t xml:space="preserve">mouse wheel</w:t>
             </w:r>
           </w:p>
         </w:tc>
@@ -634,7 +643,7 @@
               <w:pStyle w:val="Compact"/>
             </w:pPr>
             <w:r>
-              <w:t xml:space="preserve">프레임 이동</w:t>
+              <w:t xml:space="preserve">Move frame</w:t>
             </w:r>
           </w:p>
         </w:tc>
@@ -645,7 +654,7 @@
               <w:pStyle w:val="Compact"/>
             </w:pPr>
             <w:r>
-              <w:t xml:space="preserve">아래 타임라인 드래그</w:t>
+              <w:t xml:space="preserve">drag the timeline below</w:t>
             </w:r>
           </w:p>
         </w:tc>
@@ -657,7 +666,7 @@
         <w:ind w:firstLine="360"/>
       </w:pPr>
       <w:r>
-        <w:t xml:space="preserve">오른쪽</w:t>
+        <w:t xml:space="preserve">All features are controlled from the</w:t>
       </w:r>
       <w:r>
         <w:t xml:space="preserve"> </w:t>
@@ -682,10 +691,13 @@
           <w:b/>
           <w:bCs/>
         </w:rPr>
-        <w:t xml:space="preserve">패널</w:t>
-      </w:r>
-      <w:r>
-        <w:t xml:space="preserve">에서 모든 기능을 제어한다. 패널이 보이지 않으면 3D 뷰에서</w:t>
+        <w:t xml:space="preserve">panel</w:t>
+      </w:r>
+      <w:r>
+        <w:t xml:space="preserve"> </w:t>
+      </w:r>
+      <w:r>
+        <w:t xml:space="preserve">on the right. If it is hidden, press</w:t>
       </w:r>
       <w:r>
         <w:t xml:space="preserve"> </w:t>
@@ -699,27 +711,16 @@
         <w:t xml:space="preserve">N</w:t>
       </w:r>
       <w:r>
-        <w:rPr>
-          <w:b/>
-          <w:bCs/>
-        </w:rPr>
-        <w:t xml:space="preserve"> </w:t>
-      </w:r>
-      <w:r>
-        <w:rPr>
-          <w:b/>
-          <w:bCs/>
-        </w:rPr>
-        <w:t xml:space="preserve">키</w:t>
-      </w:r>
-      <w:r>
-        <w:t xml:space="preserve">를 눌러</w:t>
-      </w:r>
-      <w:r>
-        <w:t xml:space="preserve"> </w:t>
-      </w:r>
-      <w:r>
-        <w:t xml:space="preserve">사이드바를 켜고</w:t>
+        <w:t xml:space="preserve"> </w:t>
+      </w:r>
+      <w:r>
+        <w:t xml:space="preserve">in the</w:t>
+      </w:r>
+      <w:r>
+        <w:t xml:space="preserve"> </w:t>
+      </w:r>
+      <w:r>
+        <w:t xml:space="preserve">3D view to open the sidebar and select the</w:t>
       </w:r>
       <w:r>
         <w:t xml:space="preserve"> </w:t>
@@ -734,7 +735,7 @@
         <w:t xml:space="preserve"> </w:t>
       </w:r>
       <w:r>
-        <w:t xml:space="preserve">탭을 선택한다.</w:t>
+        <w:t xml:space="preserve">tab.</w:t>
       </w:r>
     </w:p>
     <w:p>
@@ -747,7 +748,7 @@
           <wp:inline>
             <wp:extent cx="2849880" cy="3189151"/>
             <wp:effectExtent b="0" l="0" r="0" t="0"/>
-            <wp:docPr descr="SOMA 사이드 패널 — run 선택(찾은 개수·Reload·Rescan) · IMU 플롯 · 표시 토글 · 재생 속도 · 플롯 갱신 속도." title="" id="916" name="Picture"/>
+            <wp:docPr descr="The SOMA side panel — run selector (count · Reload · Rescan) · IMU plot · display toggles · playback speed · plot update rate." title="" id="916" name="Picture"/>
             <a:graphic>
               <a:graphicData uri="http://schemas.openxmlformats.org/drawingml/2006/picture">
                 <pic:pic>
@@ -791,26 +792,26 @@
         <w:jc w:val="center"/>
       </w:pPr>
       <w:r>
-        <w:t xml:space="preserve">SOMA 사이드 패널 — run 선택(찾은 개수·Reload·Rescan) · IMU 플롯 · 표시 토글 · 재생 속도 · 플롯 갱신 속도.</w:t>
+        <w:t xml:space="preserve">The SOMA side panel — run selector (count · Reload · Rescan) · IMU plot · display toggles · playback speed · plot update rate.</w:t>
       </w:r>
     </w:p>
     <w:bookmarkEnd w:id="918"/>
-    <w:bookmarkStart w:id="930" w:name="기능"/>
+    <w:bookmarkStart w:id="930" w:name="features"/>
     <w:p>
       <w:pPr>
         <w:pStyle w:val="Heading1"/>
       </w:pPr>
       <w:r>
-        <w:t xml:space="preserve">4. 기능</w:t>
-      </w:r>
-    </w:p>
-    <w:bookmarkStart w:id="919" w:name="데이터-run-선택"/>
+        <w:t xml:space="preserve">4. Features</w:t>
+      </w:r>
+    </w:p>
+    <w:bookmarkStart w:id="919" w:name="dataset-run-selector"/>
     <w:p>
       <w:pPr>
         <w:pStyle w:val="Heading2"/>
       </w:pPr>
       <w:r>
-        <w:t xml:space="preserve">4.1 데이터 run 선택</w:t>
+        <w:t xml:space="preserve">4.1 Dataset run selector</w:t>
       </w:r>
     </w:p>
     <w:p>
@@ -819,7 +820,7 @@
         <w:ind w:firstLine="360"/>
       </w:pPr>
       <w:r>
-        <w:t xml:space="preserve">run이 수백~수천 개가 되면 한 목록에 다 넣을 수 없으므로,</w:t>
+        <w:t xml:space="preserve">With hundreds or thousands of runs a single list is useless, so the top of the</w:t>
       </w:r>
       <w:r>
         <w:t xml:space="preserve"> </w:t>
@@ -834,7 +835,13 @@
         <w:t xml:space="preserve"> </w:t>
       </w:r>
       <w:r>
-        <w:t xml:space="preserve">패널 상단은</w:t>
+        <w:t xml:space="preserve">panel narrows</w:t>
+      </w:r>
+      <w:r>
+        <w:t xml:space="preserve"> </w:t>
+      </w:r>
+      <w:r>
+        <w:t xml:space="preserve">in</w:t>
       </w:r>
       <w:r>
         <w:t xml:space="preserve"> </w:t>
@@ -844,16 +851,10 @@
           <w:b/>
           <w:bCs/>
         </w:rPr>
-        <w:t xml:space="preserve">3단</w:t>
-      </w:r>
-      <w:r>
-        <w:t xml:space="preserve">으로 좁혀</w:t>
-      </w:r>
-      <w:r>
-        <w:t xml:space="preserve"> </w:t>
-      </w:r>
-      <w:r>
-        <w:t xml:space="preserve">간다.</w:t>
+        <w:t xml:space="preserve">three steps</w:t>
+      </w:r>
+      <w:r>
+        <w:t xml:space="preserve">.</w:t>
       </w:r>
     </w:p>
     <w:tbl>
@@ -880,7 +881,7 @@
               <w:pStyle w:val="Compact"/>
             </w:pPr>
             <w:r>
-              <w:t xml:space="preserve">순서</w:t>
+              <w:t xml:space="preserve">Step</w:t>
             </w:r>
           </w:p>
         </w:tc>
@@ -891,7 +892,7 @@
               <w:pStyle w:val="Compact"/>
             </w:pPr>
             <w:r>
-              <w:t xml:space="preserve">컨트롤</w:t>
+              <w:t xml:space="preserve">Control</w:t>
             </w:r>
           </w:p>
         </w:tc>
@@ -902,7 +903,7 @@
               <w:pStyle w:val="Compact"/>
             </w:pPr>
             <w:r>
-              <w:t xml:space="preserve">하는 일</w:t>
+              <w:t xml:space="preserve">What it does</w:t>
             </w:r>
           </w:p>
         </w:tc>
@@ -930,13 +931,13 @@
                 <w:b/>
                 <w:bCs/>
               </w:rPr>
-              <w:t xml:space="preserve">컬렉션</w:t>
+              <w:t xml:space="preserve">Collection</w:t>
             </w:r>
             <w:r>
               <w:t xml:space="preserve"> </w:t>
             </w:r>
             <w:r>
-              <w:t xml:space="preserve">드롭다운</w:t>
+              <w:t xml:space="preserve">dropdown</w:t>
             </w:r>
           </w:p>
         </w:tc>
@@ -947,10 +948,7 @@
               <w:pStyle w:val="Compact"/>
             </w:pPr>
             <w:r>
-              <w:t xml:space="preserve">데이터셋·피험자 단위로 묶은 목록 (예:</w:t>
-            </w:r>
-            <w:r>
-              <w:t xml:space="preserve"> </w:t>
+              <w:t xml:space="preserve">Runs grouped by dataset and subject (e.g. </w:t>
             </w:r>
             <w:r>
               <w:rPr>
@@ -959,7 +957,7 @@
               <w:t xml:space="preserve">prism_faithful_full/prism-subj001 (25)</w:t>
             </w:r>
             <w:r>
-              <w:t xml:space="preserve">). 괄호 안은 그 안의 run 개수</w:t>
+              <w:t xml:space="preserve">); the number is how many runs it holds</w:t>
             </w:r>
           </w:p>
         </w:tc>
@@ -987,13 +985,13 @@
                 <w:b/>
                 <w:bCs/>
               </w:rPr>
-              <w:t xml:space="preserve">검색창</w:t>
+              <w:t xml:space="preserve">Search box</w:t>
             </w:r>
             <w:r>
               <w:t xml:space="preserve"> </w:t>
             </w:r>
             <w:r>
-              <w:t xml:space="preserve">(돋보기)</w:t>
+              <w:t xml:space="preserve">(magnifier)</w:t>
             </w:r>
           </w:p>
         </w:tc>
@@ -1004,7 +1002,7 @@
               <w:pStyle w:val="Compact"/>
             </w:pPr>
             <w:r>
-              <w:t xml:space="preserve">입력한 글자가 들어간 run만 남긴다</w:t>
+              <w:t xml:space="preserve">Keeps only runs whose name contains what you type</w:t>
             </w:r>
           </w:p>
         </w:tc>
@@ -1032,13 +1030,13 @@
                 <w:b/>
                 <w:bCs/>
               </w:rPr>
-              <w:t xml:space="preserve">run</w:t>
+              <w:t xml:space="preserve">Run</w:t>
             </w:r>
             <w:r>
               <w:t xml:space="preserve"> </w:t>
             </w:r>
             <w:r>
-              <w:t xml:space="preserve">드롭다운</w:t>
+              <w:t xml:space="preserve">dropdown</w:t>
             </w:r>
           </w:p>
         </w:tc>
@@ -1049,7 +1047,7 @@
               <w:pStyle w:val="Compact"/>
             </w:pPr>
             <w:r>
-              <w:t xml:space="preserve">위 두 조건에 맞는 run만 표시</w:t>
+              <w:t xml:space="preserve">Lists only the runs matching both</w:t>
             </w:r>
           </w:p>
         </w:tc>
@@ -1061,34 +1059,13 @@
         <w:ind w:firstLine="360"/>
       </w:pPr>
       <w:r>
-        <w:t xml:space="preserve">컬렉션을 바꾸면 run 목록이 그 컬렉션으로 바뀌고, 첫 run이 자동으로 선택돼 인체·IMU 애니메이션이</w:t>
-      </w:r>
-      <w:r>
-        <w:t xml:space="preserve"> </w:t>
-      </w:r>
-      <w:r>
-        <w:t xml:space="preserve">다시 만들어진다(리그 재구성에 수 초~수십 초).</w:t>
-      </w:r>
-      <w:r>
-        <w:t xml:space="preserve"> </w:t>
-      </w:r>
-      <w:r>
-        <w:rPr>
-          <w:rStyle w:val="VerbatimChar"/>
-        </w:rPr>
-        <w:t xml:space="preserve">[Reload run]</w:t>
-      </w:r>
-      <w:r>
-        <w:t xml:space="preserve"> </w:t>
-      </w:r>
-      <w:r>
-        <w:t xml:space="preserve">버튼으로 현재 run을 다시 빌드할 수도</w:t>
-      </w:r>
-      <w:r>
-        <w:t xml:space="preserve"> </w:t>
-      </w:r>
-      <w:r>
-        <w:t xml:space="preserve">있다. 한 컬렉션에 run이 아주 많으면 목록은 200개까지만 보여주고</w:t>
+        <w:t xml:space="preserve">Changing the collection re-points the run list and selects its first run, rebuilding the body + IMU</w:t>
+      </w:r>
+      <w:r>
+        <w:t xml:space="preserve"> </w:t>
+      </w:r>
+      <w:r>
+        <w:t xml:space="preserve">animation (seconds to tens of seconds for the rig).</w:t>
       </w:r>
       <w:r>
         <w:t xml:space="preserve"> </w:t>
@@ -1098,16 +1075,38 @@
           <w:b/>
           <w:bCs/>
         </w:rPr>
+        <w:t xml:space="preserve">[Reload run]</w:t>
+      </w:r>
+      <w:r>
+        <w:t xml:space="preserve"> </w:t>
+      </w:r>
+      <w:r>
+        <w:t xml:space="preserve">rebuilds the current run. If a</w:t>
+      </w:r>
+      <w:r>
+        <w:t xml:space="preserve"> </w:t>
+      </w:r>
+      <w:r>
+        <w:t xml:space="preserve">collection holds a great many runs the list shows the first 200 and says</w:t>
+      </w:r>
+      <w:r>
+        <w:t xml:space="preserve"> </w:t>
+      </w:r>
+      <w:r>
+        <w:rPr>
+          <w:b/>
+          <w:bCs/>
+        </w:rPr>
         <w:t xml:space="preserve">“showing N of M”</w:t>
       </w:r>
       <w:r>
-        <w:t xml:space="preserve">을 함께</w:t>
-      </w:r>
-      <w:r>
-        <w:t xml:space="preserve"> </w:t>
-      </w:r>
-      <w:r>
-        <w:t xml:space="preserve">표시하므로, 검색창으로 더 좁히면 된다(조용히 잘라내지 않는다).</w:t>
+        <w:t xml:space="preserve">, so you</w:t>
+      </w:r>
+      <w:r>
+        <w:t xml:space="preserve"> </w:t>
+      </w:r>
+      <w:r>
+        <w:t xml:space="preserve">can narrow further with the search box — nothing is truncated silently.</w:t>
       </w:r>
     </w:p>
     <w:p>
@@ -1120,23 +1119,24 @@
           <w:b/>
           <w:bCs/>
         </w:rPr>
-        <w:t xml:space="preserve">드롭다운을 열 때마다 데이터셋 폴더를 다시 검색</w:t>
-      </w:r>
-      <w:r>
-        <w:t xml:space="preserve">하므로, 뷰어를 켜 둔 채 새 run을 복사해 넣어도</w:t>
-      </w:r>
-      <w:r>
-        <w:t xml:space="preserve"> </w:t>
-      </w:r>
-      <w:r>
-        <w:t xml:space="preserve">목록에 나타난다. 곧바로 다시 찾게 하려면</w:t>
-      </w:r>
-      <w:r>
-        <w:t xml:space="preserve"> </w:t>
-      </w:r>
-      <w:r>
-        <w:rPr>
-          <w:rStyle w:val="VerbatimChar"/>
+        <w:t xml:space="preserve">Opening a dropdown re-scans the dataset folder</w:t>
+      </w:r>
+      <w:r>
+        <w:t xml:space="preserve">, so a run copied in while the viewer is running</w:t>
+      </w:r>
+      <w:r>
+        <w:t xml:space="preserve"> </w:t>
+      </w:r>
+      <w:r>
+        <w:t xml:space="preserve">still shows up. Press</w:t>
+      </w:r>
+      <w:r>
+        <w:t xml:space="preserve"> </w:t>
+      </w:r>
+      <w:r>
+        <w:rPr>
+          <w:b/>
+          <w:bCs/>
         </w:rPr>
         <w:t xml:space="preserve">[Rescan dataset]</w:t>
       </w:r>
@@ -1144,23 +1144,23 @@
         <w:t xml:space="preserve"> </w:t>
       </w:r>
       <w:r>
-        <w:t xml:space="preserve">버튼을 누른다. 맨 위에는 전체에서</w:t>
-      </w:r>
-      <w:r>
-        <w:t xml:space="preserve"> </w:t>
-      </w:r>
-      <w:r>
-        <w:t xml:space="preserve">찾은 run 개수가 표시된다.</w:t>
+        <w:t xml:space="preserve">to look again immediately. The total number of runs found</w:t>
+      </w:r>
+      <w:r>
+        <w:t xml:space="preserve"> </w:t>
+      </w:r>
+      <w:r>
+        <w:t xml:space="preserve">is shown at the top.</w:t>
       </w:r>
     </w:p>
     <w:bookmarkEnd w:id="919"/>
-    <w:bookmarkStart w:id="923" w:name="imu-라이브-플롯"/>
+    <w:bookmarkStart w:id="923" w:name="imu-live-plot"/>
     <w:p>
       <w:pPr>
         <w:pStyle w:val="Heading2"/>
       </w:pPr>
       <w:r>
-        <w:t xml:space="preserve">4.2 IMU 라이브 플롯</w:t>
+        <w:t xml:space="preserve">4.2 IMU live plot</w:t>
       </w:r>
     </w:p>
     <w:p>
@@ -1169,17 +1169,42 @@
         <w:ind w:firstLine="360"/>
       </w:pPr>
       <w:r>
+        <w:t xml:space="preserve">Pick an IMU from the</w:t>
+      </w:r>
+      <w:r>
+        <w:t xml:space="preserve"> </w:t>
+      </w:r>
+      <w:hyperlink w:anchor="imu-live-plot">
+        <w:r>
+          <w:rPr>
+            <w:rStyle w:val="Hyperlink"/>
+            <w:b/>
+            <w:bCs/>
+          </w:rPr>
+          <w:t xml:space="preserve">IMU live plot</w:t>
+        </w:r>
+      </w:hyperlink>
+      <w:r>
+        <w:t xml:space="preserve"> </w:t>
+      </w:r>
+      <w:r>
+        <w:t xml:space="preserve">dropdown and its signals show in the adjacent image panel in</w:t>
+      </w:r>
+      <w:r>
+        <w:t xml:space="preserve"> </w:t>
+      </w:r>
+      <w:r>
         <w:rPr>
           <w:b/>
           <w:bCs/>
         </w:rPr>
-        <w:t xml:space="preserve">[IMU live plot]</w:t>
-      </w:r>
-      <w:r>
-        <w:t xml:space="preserve"> </w:t>
-      </w:r>
-      <w:r>
-        <w:t xml:space="preserve">드롭다운에서 IMU를 고르면, 그 센서의 신호가 옆 이미지 패널에</w:t>
+        <w:t xml:space="preserve">three stacked plots</w:t>
+      </w:r>
+      <w:r>
+        <w:t xml:space="preserve"> </w:t>
+      </w:r>
+      <w:r>
+        <w:t xml:space="preserve">— from top:</w:t>
       </w:r>
       <w:r>
         <w:t xml:space="preserve"> </w:t>
@@ -1189,37 +1214,13 @@
           <w:b/>
           <w:bCs/>
         </w:rPr>
-        <w:t xml:space="preserve">3단</w:t>
-      </w:r>
-      <w:r>
-        <w:t xml:space="preserve">으로</w:t>
-      </w:r>
-      <w:r>
-        <w:t xml:space="preserve"> </w:t>
-      </w:r>
-      <w:r>
-        <w:t xml:space="preserve">표시된다 — 위에서부터</w:t>
-      </w:r>
-      <w:r>
-        <w:t xml:space="preserve"> </w:t>
+        <w:t xml:space="preserve">acceleration (m/s²) · angular velocity (deg/s) · orientation</w:t>
       </w:r>
       <w:r>
         <w:rPr>
           <w:b/>
           <w:bCs/>
         </w:rPr>
-        <w:t xml:space="preserve">가속도(m/s²) · 각속도(deg/s) · 방향(deg, roll·pitch·yaw)</w:t>
-      </w:r>
-      <w:r>
-        <w:t xml:space="preserve">. 각 패널의 세</w:t>
-      </w:r>
-      <w:r>
-        <w:t xml:space="preserve"> </w:t>
-      </w:r>
-      <w:r>
-        <w:t xml:space="preserve">선 색(빨강·초록·파랑)은 3D 화면의 RGB 축과 같은 X·Y·Z 축이다. 재생하면</w:t>
-      </w:r>
-      <w:r>
         <w:t xml:space="preserve"> </w:t>
       </w:r>
       <w:r>
@@ -1227,16 +1228,32 @@
           <w:b/>
           <w:bCs/>
         </w:rPr>
-        <w:t xml:space="preserve">세로 커서</w:t>
-      </w:r>
-      <w:r>
-        <w:t xml:space="preserve">가 현재</w:t>
-      </w:r>
-      <w:r>
-        <w:t xml:space="preserve"> </w:t>
-      </w:r>
-      <w:r>
-        <w:t xml:space="preserve">프레임을 따라 움직인다.</w:t>
+        <w:t xml:space="preserve">(deg, roll·pitch·yaw)</w:t>
+      </w:r>
+      <w:r>
+        <w:t xml:space="preserve">. The three line colors (red·green·blue) in each plot are the same X·Y·Z axes as</w:t>
+      </w:r>
+      <w:r>
+        <w:t xml:space="preserve"> </w:t>
+      </w:r>
+      <w:r>
+        <w:t xml:space="preserve">the RGB axes in the 3D view. During playback a</w:t>
+      </w:r>
+      <w:r>
+        <w:t xml:space="preserve"> </w:t>
+      </w:r>
+      <w:r>
+        <w:rPr>
+          <w:b/>
+          <w:bCs/>
+        </w:rPr>
+        <w:t xml:space="preserve">vertical cursor</w:t>
+      </w:r>
+      <w:r>
+        <w:t xml:space="preserve"> </w:t>
+      </w:r>
+      <w:r>
+        <w:t xml:space="preserve">tracks the current frame.</w:t>
       </w:r>
     </w:p>
     <w:p>
@@ -1249,7 +1266,7 @@
           <wp:inline>
             <wp:extent cx="3108960" cy="3956858"/>
             <wp:effectExtent b="0" l="0" r="0" t="0"/>
-            <wp:docPr descr="IMU 라이브 플롯 — 가속도·각속도·방향 3단, 세로선은 현재 프레임." title="" id="921" name="Picture"/>
+            <wp:docPr descr="IMU live plot — acceleration, angular velocity, orientation (3 panels); the vertical line is the current frame." title="" id="921" name="Picture"/>
             <a:graphic>
               <a:graphicData uri="http://schemas.openxmlformats.org/drawingml/2006/picture">
                 <pic:pic>
@@ -1293,7 +1310,7 @@
         <w:jc w:val="center"/>
       </w:pPr>
       <w:r>
-        <w:t xml:space="preserve">IMU 라이브 플롯 — 가속도·각속도·방향 3단, 세로선은 현재 프레임.</w:t>
+        <w:t xml:space="preserve">IMU live plot — acceleration, angular velocity, orientation (3 panels); the vertical line is the current frame.</w:t>
       </w:r>
     </w:p>
     <w:p>
@@ -1302,7 +1319,7 @@
         <w:ind w:firstLine="360"/>
       </w:pPr>
       <w:r>
-        <w:t xml:space="preserve">드롭다운의 이름은</w:t>
+        <w:t xml:space="preserve">The dropdown names are the</w:t>
       </w:r>
       <w:r>
         <w:t xml:space="preserve"> </w:t>
@@ -1314,7 +1331,10 @@
         <w:t xml:space="preserve">small_reference.npz</w:t>
       </w:r>
       <w:r>
-        <w:t xml:space="preserve">의 센서 코드와 동일하다:</w:t>
+        <w:t xml:space="preserve"> </w:t>
+      </w:r>
+      <w:r>
+        <w:t xml:space="preserve">sensor codes directly:</w:t>
       </w:r>
       <w:r>
         <w:t xml:space="preserve"> </w:t>
@@ -1326,7 +1346,16 @@
         <w:t xml:space="preserve">back_T4</w:t>
       </w:r>
       <w:r>
-        <w:t xml:space="preserve">(등·상부 흉추) ·</w:t>
+        <w:t xml:space="preserve"> </w:t>
+      </w:r>
+      <w:r>
+        <w:t xml:space="preserve">(upper thoracic</w:t>
+      </w:r>
+      <w:r>
+        <w:t xml:space="preserve"> </w:t>
+      </w:r>
+      <w:r>
+        <w:t xml:space="preserve">back) ·</w:t>
       </w:r>
       <w:r>
         <w:t xml:space="preserve"> </w:t>
@@ -1338,7 +1367,10 @@
         <w:t xml:space="preserve">occiput</w:t>
       </w:r>
       <w:r>
-        <w:t xml:space="preserve">(후두부) ·</w:t>
+        <w:t xml:space="preserve"> </w:t>
+      </w:r>
+      <w:r>
+        <w:t xml:space="preserve">(back of head) ·</w:t>
       </w:r>
       <w:r>
         <w:t xml:space="preserve"> </w:t>
@@ -1359,7 +1391,10 @@
         <w:t xml:space="preserve">wrist_r</w:t>
       </w:r>
       <w:r>
-        <w:t xml:space="preserve">(손목) ·</w:t>
+        <w:t xml:space="preserve"> </w:t>
+      </w:r>
+      <w:r>
+        <w:t xml:space="preserve">·</w:t>
       </w:r>
       <w:r>
         <w:t xml:space="preserve"> </w:t>
@@ -1380,7 +1415,10 @@
         <w:t xml:space="preserve">shank_r</w:t>
       </w:r>
       <w:r>
-        <w:t xml:space="preserve">(정강이) ·</w:t>
+        <w:t xml:space="preserve"> </w:t>
+      </w:r>
+      <w:r>
+        <w:t xml:space="preserve">·</w:t>
       </w:r>
       <w:r>
         <w:t xml:space="preserve"> </w:t>
@@ -1401,17 +1439,20 @@
         <w:t xml:space="preserve">foot_r</w:t>
       </w:r>
       <w:r>
-        <w:t xml:space="preserve">(발·인솔).</w:t>
+        <w:t xml:space="preserve"> </w:t>
+      </w:r>
+      <w:r>
+        <w:t xml:space="preserve">(insole).</w:t>
       </w:r>
     </w:p>
     <w:bookmarkEnd w:id="923"/>
-    <w:bookmarkStart w:id="927" w:name="표시-토글"/>
+    <w:bookmarkStart w:id="927" w:name="display-toggles"/>
     <w:p>
       <w:pPr>
         <w:pStyle w:val="Heading2"/>
       </w:pPr>
       <w:r>
-        <w:t xml:space="preserve">4.3 표시 토글</w:t>
+        <w:t xml:space="preserve">4.3 Display toggles</w:t>
       </w:r>
     </w:p>
     <w:p>
@@ -1420,16 +1461,7 @@
         <w:ind w:firstLine="360"/>
       </w:pPr>
       <w:r>
-        <w:rPr>
-          <w:rStyle w:val="VerbatimChar"/>
-        </w:rPr>
-        <w:t xml:space="preserve">SOMA</w:t>
-      </w:r>
-      <w:r>
-        <w:t xml:space="preserve"> </w:t>
-      </w:r>
-      <w:r>
-        <w:t xml:space="preserve">패널</w:t>
+        <w:t xml:space="preserve">Two toggles on the</w:t>
       </w:r>
       <w:r>
         <w:t xml:space="preserve"> </w:t>
@@ -1445,7 +1477,22 @@
         <w:t xml:space="preserve"> </w:t>
       </w:r>
       <w:r>
-        <w:t xml:space="preserve">줄의 두 토글로 화면을 정리한다.</w:t>
+        <w:t xml:space="preserve">row of the</w:t>
+      </w:r>
+      <w:r>
+        <w:t xml:space="preserve"> </w:t>
+      </w:r>
+      <w:r>
+        <w:rPr>
+          <w:rStyle w:val="VerbatimChar"/>
+        </w:rPr>
+        <w:t xml:space="preserve">SOMA</w:t>
+      </w:r>
+      <w:r>
+        <w:t xml:space="preserve"> </w:t>
+      </w:r>
+      <w:r>
+        <w:t xml:space="preserve">panel keep the view clean.</w:t>
       </w:r>
     </w:p>
     <w:p>
@@ -1458,7 +1505,7 @@
           <wp:inline>
             <wp:extent cx="2281187" cy="1010652"/>
             <wp:effectExtent b="0" l="0" r="0" t="0"/>
-            <wp:docPr descr="Display 토글 — IMU 축과 관절 뼈대의 표시/숨김." title="" id="925" name="Picture"/>
+            <wp:docPr descr="Display toggles — show/hide the IMU axes and the joint skeleton." title="" id="925" name="Picture"/>
             <a:graphic>
               <a:graphicData uri="http://schemas.openxmlformats.org/drawingml/2006/picture">
                 <pic:pic>
@@ -1502,7 +1549,7 @@
         <w:jc w:val="center"/>
       </w:pPr>
       <w:r>
-        <w:t xml:space="preserve">Display 토글 — IMU 축과 관절 뼈대의 표시/숨김.</w:t>
+        <w:t xml:space="preserve">Display toggles — show/hide the IMU axes and the joint skeleton.</w:t>
       </w:r>
     </w:p>
     <w:p>
@@ -1524,7 +1571,7 @@
         <w:t xml:space="preserve"> </w:t>
       </w:r>
       <w:r>
-        <w:t xml:space="preserve">(기본 켜짐): 8개 IMU RGB 축의 표시/숨김.</w:t>
+        <w:t xml:space="preserve">(on by default): show/hide the 8 IMU RGB axes.</w:t>
       </w:r>
     </w:p>
     <w:p>
@@ -1546,23 +1593,23 @@
         <w:t xml:space="preserve"> </w:t>
       </w:r>
       <w:r>
-        <w:t xml:space="preserve">(기본 꺼짐): SMPL 관절 뼈대(아마추어)의 표시/숨김. 관절마다 하나씩 24개가 있으므로</w:t>
-      </w:r>
-      <w:r>
-        <w:t xml:space="preserve"> </w:t>
-      </w:r>
-      <w:r>
-        <w:t xml:space="preserve">기본은 숨김이다. 뼈대를 숨겨도 메시는 정상적으로 움직인다.</w:t>
+        <w:t xml:space="preserve">(off by default): show/hide the SMPL joint skeleton (armature). There is one bone per</w:t>
+      </w:r>
+      <w:r>
+        <w:t xml:space="preserve"> </w:t>
+      </w:r>
+      <w:r>
+        <w:t xml:space="preserve">joint (24 total), so it is hidden by default. Hiding it does not affect the mesh deformation.</w:t>
       </w:r>
     </w:p>
     <w:bookmarkEnd w:id="927"/>
-    <w:bookmarkStart w:id="928" w:name="재생-속도"/>
+    <w:bookmarkStart w:id="928" w:name="playback-speed"/>
     <w:p>
       <w:pPr>
         <w:pStyle w:val="Heading2"/>
       </w:pPr>
       <w:r>
-        <w:t xml:space="preserve">4.4 재생 속도</w:t>
+        <w:t xml:space="preserve">4.4 Playback speed</w:t>
       </w:r>
     </w:p>
     <w:p>
@@ -1571,6 +1618,12 @@
         <w:ind w:firstLine="360"/>
       </w:pPr>
       <w:r>
+        <w:t xml:space="preserve">The</w:t>
+      </w:r>
+      <w:r>
+        <w:t xml:space="preserve"> </w:t>
+      </w:r>
+      <w:r>
         <w:rPr>
           <w:b/>
           <w:bCs/>
@@ -1581,7 +1634,7 @@
         <w:t xml:space="preserve"> </w:t>
       </w:r>
       <w:r>
-        <w:t xml:space="preserve">슬라이더로 재생 속도를 조절한다. 데이터가 100 Hz이므로</w:t>
+        <w:t xml:space="preserve">slider sets the playback rate. The data is 100 Hz, so</w:t>
       </w:r>
       <w:r>
         <w:t xml:space="preserve"> </w:t>
@@ -1591,22 +1644,25 @@
           <w:b/>
           <w:bCs/>
         </w:rPr>
-        <w:t xml:space="preserve">100 = 실시간</w:t>
-      </w:r>
-      <w:r>
-        <w:t xml:space="preserve">(전체 10초),</w:t>
-      </w:r>
-      <w:r>
-        <w:t xml:space="preserve"> </w:t>
-      </w:r>
-      <w:r>
-        <w:t xml:space="preserve">낮추면 느리게(예: 25 → 4배 슬로), 높이면 빠르게. 무거운 장면이라 PC가 100 fps를 못 따라가면 실제</w:t>
-      </w:r>
-      <w:r>
-        <w:t xml:space="preserve"> </w:t>
-      </w:r>
-      <w:r>
-        <w:t xml:space="preserve">재생이 느려지는데, 이 뷰어는</w:t>
+        <w:t xml:space="preserve">100 = real time</w:t>
+      </w:r>
+      <w:r>
+        <w:t xml:space="preserve"> </w:t>
+      </w:r>
+      <w:r>
+        <w:t xml:space="preserve">(10 s</w:t>
+      </w:r>
+      <w:r>
+        <w:t xml:space="preserve"> </w:t>
+      </w:r>
+      <w:r>
+        <w:t xml:space="preserve">total); lower is slower (e.g. 25 → 4× slow motion), higher is faster. The scene is heavy, so if the PC</w:t>
+      </w:r>
+      <w:r>
+        <w:t xml:space="preserve"> </w:t>
+      </w:r>
+      <w:r>
+        <w:t xml:space="preserve">cannot reach 100 fps the playback slows down — but this viewer uses</w:t>
       </w:r>
       <w:r>
         <w:t xml:space="preserve"> </w:t>
@@ -1616,13 +1672,16 @@
           <w:b/>
           <w:bCs/>
         </w:rPr>
-        <w:t xml:space="preserve">프레임 드롭</w:t>
-      </w:r>
-      <w:r>
-        <w:t xml:space="preserve"> </w:t>
-      </w:r>
-      <w:r>
-        <w:t xml:space="preserve">방식이라 못 그리는 프레임을 건너뛰며</w:t>
+        <w:t xml:space="preserve">frame dropping</w:t>
+      </w:r>
+      <w:r>
+        <w:t xml:space="preserve">, so it skips</w:t>
+      </w:r>
+      <w:r>
+        <w:t xml:space="preserve"> </w:t>
+      </w:r>
+      <w:r>
+        <w:t xml:space="preserve">frames it cannot draw and</w:t>
       </w:r>
       <w:r>
         <w:t xml:space="preserve"> </w:t>
@@ -1632,13 +1691,71 @@
           <w:b/>
           <w:bCs/>
         </w:rPr>
-        <w:t xml:space="preserve">실제 시간 속도로</w:t>
+        <w:t xml:space="preserve">plays at real-time speed</w:t>
+      </w:r>
+      <w:r>
+        <w:t xml:space="preserve">. If it is still slow, lower the Speed for smooth</w:t>
+      </w:r>
+      <w:r>
+        <w:t xml:space="preserve"> </w:t>
+      </w:r>
+      <w:r>
+        <w:t xml:space="preserve">playback.</w:t>
+      </w:r>
+    </w:p>
+    <w:bookmarkEnd w:id="928"/>
+    <w:bookmarkStart w:id="929" w:name="plot-update-rate-3d-smoothness"/>
+    <w:p>
+      <w:pPr>
+        <w:pStyle w:val="Heading2"/>
+      </w:pPr>
+      <w:r>
+        <w:t xml:space="preserve">4.5 Plot update rate (3D smoothness)</w:t>
+      </w:r>
+    </w:p>
+    <w:p>
+      <w:pPr>
+        <w:pStyle w:val="FirstParagraph"/>
+        <w:ind w:firstLine="360"/>
+      </w:pPr>
+      <w:r>
+        <w:t xml:space="preserve">The</w:t>
+      </w:r>
+      <w:r>
+        <w:t xml:space="preserve"> </w:t>
       </w:r>
       <w:r>
         <w:rPr>
           <w:b/>
           <w:bCs/>
         </w:rPr>
+        <w:t xml:space="preserve">[Plot update (Hz)]</w:t>
+      </w:r>
+      <w:r>
+        <w:t xml:space="preserve"> </w:t>
+      </w:r>
+      <w:r>
+        <w:t xml:space="preserve">slider sets how many times per second the IMU plot is redrawn during</w:t>
+      </w:r>
+      <w:r>
+        <w:t xml:space="preserve"> </w:t>
+      </w:r>
+      <w:r>
+        <w:t xml:space="preserve">playback (default</w:t>
+      </w:r>
+      <w:r>
+        <w:t xml:space="preserve"> </w:t>
+      </w:r>
+      <w:r>
+        <w:rPr>
+          <w:rStyle w:val="VerbatimChar"/>
+        </w:rPr>
+        <w:t xml:space="preserve">20</w:t>
+      </w:r>
+      <w:r>
+        <w:t xml:space="preserve">). Redrawing that plot is the most expensive thing happening during playback, so</w:t>
+      </w:r>
+      <w:r>
         <w:t xml:space="preserve"> </w:t>
       </w:r>
       <w:r>
@@ -1646,67 +1763,7 @@
           <w:b/>
           <w:bCs/>
         </w:rPr>
-        <w:t xml:space="preserve">재생</w:t>
-      </w:r>
-      <w:r>
-        <w:t xml:space="preserve">한다. 그래도 느리면 Speed를 낮춰 부드럽게 본다.</w:t>
-      </w:r>
-    </w:p>
-    <w:bookmarkEnd w:id="928"/>
-    <w:bookmarkStart w:id="929" w:name="플롯-갱신-속도-3d-부드러움"/>
-    <w:p>
-      <w:pPr>
-        <w:pStyle w:val="Heading2"/>
-      </w:pPr>
-      <w:r>
-        <w:t xml:space="preserve">4.5 플롯 갱신 속도 (3D 부드러움)</w:t>
-      </w:r>
-    </w:p>
-    <w:p>
-      <w:pPr>
-        <w:pStyle w:val="FirstParagraph"/>
-        <w:ind w:firstLine="360"/>
-      </w:pPr>
-      <w:r>
-        <w:rPr>
-          <w:b/>
-          <w:bCs/>
-        </w:rPr>
-        <w:t xml:space="preserve">[Plot update (Hz)]</w:t>
-      </w:r>
-      <w:r>
-        <w:t xml:space="preserve"> </w:t>
-      </w:r>
-      <w:r>
-        <w:t xml:space="preserve">슬라이더는 재생 중 IMU 플롯을 초당 몇 번 다시 그릴지 정한다(기본</w:t>
-      </w:r>
-      <w:r>
-        <w:t xml:space="preserve"> </w:t>
-      </w:r>
-      <w:r>
-        <w:rPr>
-          <w:rStyle w:val="VerbatimChar"/>
-        </w:rPr>
-        <w:t xml:space="preserve">20</w:t>
-      </w:r>
-      <w:r>
-        <w:t xml:space="preserve">).</w:t>
-      </w:r>
-      <w:r>
-        <w:t xml:space="preserve"> </w:t>
-      </w:r>
-      <w:r>
-        <w:t xml:space="preserve">재생 중 가장 무거운 작업이 이 플롯 다시 그리기라서,</w:t>
-      </w:r>
-      <w:r>
-        <w:t xml:space="preserve"> </w:t>
-      </w:r>
-      <w:r>
-        <w:rPr>
-          <w:b/>
-          <w:bCs/>
-        </w:rPr>
-        <w:t xml:space="preserve">이 값을 낮추면 3D 화면이 더 부드러워진다.</w:t>
+        <w:t xml:space="preserve">lowering this makes the 3D view smoother.</w:t>
       </w:r>
     </w:p>
     <w:tbl>
@@ -1732,7 +1789,7 @@
               <w:pStyle w:val="Compact"/>
             </w:pPr>
             <w:r>
-              <w:t xml:space="preserve">값</w:t>
+              <w:t xml:space="preserve">Value</w:t>
             </w:r>
           </w:p>
         </w:tc>
@@ -1743,7 +1800,7 @@
               <w:pStyle w:val="Compact"/>
             </w:pPr>
             <w:r>
-              <w:t xml:space="preserve">동작</w:t>
+              <w:t xml:space="preserve">Behaviour</w:t>
             </w:r>
           </w:p>
         </w:tc>
@@ -1765,7 +1822,7 @@
               <w:t xml:space="preserve"> </w:t>
             </w:r>
             <w:r>
-              <w:t xml:space="preserve">(기본)</w:t>
+              <w:t xml:space="preserve">(default)</w:t>
             </w:r>
           </w:p>
         </w:tc>
@@ -1776,7 +1833,7 @@
               <w:pStyle w:val="Compact"/>
             </w:pPr>
             <w:r>
-              <w:t xml:space="preserve">초당 20회 갱신 — 커서가 재생을 바짝 따라간다</w:t>
+              <w:t xml:space="preserve">20 redraws/s — the cursor keeps up with playback</w:t>
             </w:r>
           </w:p>
         </w:tc>
@@ -1803,7 +1860,7 @@
               <w:pStyle w:val="Compact"/>
             </w:pPr>
             <w:r>
-              <w:t xml:space="preserve">최대. 커서가 가장 촘촘하지만 3D는 느려질 수 있다</w:t>
+              <w:t xml:space="preserve">the maximum; finest cursor, at the cost of 3D speed</w:t>
             </w:r>
           </w:p>
         </w:tc>
@@ -1839,7 +1896,7 @@
               <w:pStyle w:val="Compact"/>
             </w:pPr>
             <w:r>
-              <w:t xml:space="preserve">갱신을 줄여 3D를 우선 (</w:t>
+              <w:t xml:space="preserve">fewer redraws, 3D gets priority (</w:t>
             </w:r>
             <w:r>
               <w:rPr>
@@ -1848,7 +1905,10 @@
               <w:t xml:space="preserve">4</w:t>
             </w:r>
             <w:r>
-              <w:t xml:space="preserve">가 예전 기본값)</w:t>
+              <w:t xml:space="preserve"> </w:t>
+            </w:r>
+            <w:r>
+              <w:t xml:space="preserve">was the previous default)</w:t>
             </w:r>
           </w:p>
         </w:tc>
@@ -1884,7 +1944,7 @@
               <w:pStyle w:val="Compact"/>
             </w:pPr>
             <w:r>
-              <w:t xml:space="preserve">거의 갱신하지 않음</w:t>
+              <w:t xml:space="preserve">redraws almost never</w:t>
             </w:r>
           </w:p>
         </w:tc>
@@ -1911,7 +1971,7 @@
               <w:pStyle w:val="Compact"/>
             </w:pPr>
             <w:r>
-              <w:t xml:space="preserve">재생 중에는 갱신하지 않음(정지·스크럽할 때만) —</w:t>
+              <w:t xml:space="preserve">no redraws during playback (only on pause/scrub) —</w:t>
             </w:r>
             <w:r>
               <w:t xml:space="preserve"> </w:t>
@@ -1921,7 +1981,7 @@
                 <w:b/>
                 <w:bCs/>
               </w:rPr>
-              <w:t xml:space="preserve">3D가 가장 부드럽다</w:t>
+              <w:t xml:space="preserve">smoothest 3D</w:t>
             </w:r>
           </w:p>
         </w:tc>
@@ -1933,24 +1993,33 @@
         <w:ind w:firstLine="360"/>
       </w:pPr>
       <w:r>
+        <w:t xml:space="preserve">Even at</w:t>
+      </w:r>
+      <w:r>
+        <w:t xml:space="preserve"> </w:t>
+      </w:r>
+      <w:r>
         <w:rPr>
           <w:rStyle w:val="VerbatimChar"/>
         </w:rPr>
         <w:t xml:space="preserve">0</w:t>
       </w:r>
       <w:r>
-        <w:t xml:space="preserve">으로 두어도 IMU를 바꾸거나 정지하면 플롯은 즉시 갱신된다.</w:t>
+        <w:t xml:space="preserve"> </w:t>
+      </w:r>
+      <w:r>
+        <w:t xml:space="preserve">the plot refreshes immediately when you pause or pick a different IMU.</w:t>
       </w:r>
     </w:p>
     <w:bookmarkEnd w:id="929"/>
     <w:bookmarkEnd w:id="930"/>
-    <w:bookmarkStart w:id="940" w:name="데이터-위치와-새-run-추가"/>
+    <w:bookmarkStart w:id="940" w:name="data-location-and-adding-runs"/>
     <w:p>
       <w:pPr>
         <w:pStyle w:val="Heading1"/>
       </w:pPr>
       <w:r>
-        <w:t xml:space="preserve">5. 데이터 위치와 새 run 추가</w:t>
+        <w:t xml:space="preserve">5. Data location and adding runs</w:t>
       </w:r>
     </w:p>
     <w:p>
@@ -1959,7 +2028,7 @@
         <w:ind w:firstLine="360"/>
       </w:pPr>
       <w:r>
-        <w:t xml:space="preserve">뷰어 안에는 데이터가 없다. 뷰어는</w:t>
+        <w:t xml:space="preserve">The viewer carries no data. It reads</w:t>
       </w:r>
       <w:r>
         <w:t xml:space="preserve"> </w:t>
@@ -1969,16 +2038,16 @@
           <w:b/>
           <w:bCs/>
         </w:rPr>
-        <w:t xml:space="preserve">실행한 PC의 번들</w:t>
-      </w:r>
-      <w:r>
-        <w:t xml:space="preserve">을 읽는다. 번들은 그것을 만든 PC에 두며</w:t>
-      </w:r>
-      <w:r>
-        <w:t xml:space="preserve"> </w:t>
-      </w:r>
-      <w:r>
-        <w:t xml:space="preserve">(ADR-0041), 그 PC의 데이터 루트는 환경변수</w:t>
+        <w:t xml:space="preserve">the bundles on the PC it runs on</w:t>
+      </w:r>
+      <w:r>
+        <w:t xml:space="preserve">. Bundles stay on the PC</w:t>
+      </w:r>
+      <w:r>
+        <w:t xml:space="preserve"> </w:t>
+      </w:r>
+      <w:r>
+        <w:t xml:space="preserve">that made them (ADR-0041), and that PC’s data root is what the</w:t>
       </w:r>
       <w:r>
         <w:t xml:space="preserve"> </w:t>
@@ -1990,7 +2059,16 @@
         <w:t xml:space="preserve">SOMA_DATA_ROOT</w:t>
       </w:r>
       <w:r>
-        <w:t xml:space="preserve">가 가리킨다.</w:t>
+        <w:t xml:space="preserve"> </w:t>
+      </w:r>
+      <w:r>
+        <w:t xml:space="preserve">environment variable</w:t>
+      </w:r>
+      <w:r>
+        <w:t xml:space="preserve"> </w:t>
+      </w:r>
+      <w:r>
+        <w:t xml:space="preserve">names.</w:t>
       </w:r>
     </w:p>
     <w:p>
@@ -2020,7 +2098,7 @@
         <w:rPr>
           <w:rStyle w:val="VerbatimChar"/>
         </w:rPr>
-        <w:t xml:space="preserve">│   ├─ &lt;번들&gt;\                  ← 데이터 (예: gaitex_unified8, hknu_unified8)</w:t>
+        <w:t xml:space="preserve">│   ├─ &lt;bundle&gt;\                &lt;- the data (e.g. gaitex_unified8, hknu_unified8)</w:t>
       </w:r>
       <w:r>
         <w:br/>
@@ -2029,7 +2107,7 @@
         <w:rPr>
           <w:rStyle w:val="VerbatimChar"/>
         </w:rPr>
-        <w:t xml:space="preserve">│   │   ├─ INDEX.json           ← 수록된 run 목록 (뷰어가 이것으로 빠르게 찾는다)</w:t>
+        <w:t xml:space="preserve">│   │   ├─ INDEX.json           &lt;- list of runs it holds; the viewer reads this to find them fast</w:t>
       </w:r>
       <w:r>
         <w:br/>
@@ -2047,7 +2125,7 @@
         <w:rPr>
           <w:rStyle w:val="VerbatimChar"/>
         </w:rPr>
-        <w:t xml:space="preserve">│   └─ _runs\  _superseded\     ← 실행 기록·증거 (뷰어는 훑지 않는다)</w:t>
+        <w:t xml:space="preserve">│   └─ _runs\  _superseded\     &lt;- run records and evidence (the viewer does not walk them)</w:t>
       </w:r>
       <w:r>
         <w:br/>
@@ -2056,7 +2134,7 @@
         <w:rPr>
           <w:rStyle w:val="VerbatimChar"/>
         </w:rPr>
-        <w:t xml:space="preserve">└─ body_models\smpl\            ← SMPL 모델 (SOMA_BODY_MODEL_DIR 로 옮길 수 있다)</w:t>
+        <w:t xml:space="preserve">└─ body_models\smpl\            &lt;- SMPL models (movable with SOMA_BODY_MODEL_DIR)</w:t>
       </w:r>
       <w:r>
         <w:br/>
@@ -2068,7 +2146,7 @@
         <w:rPr>
           <w:rStyle w:val="VerbatimChar"/>
         </w:rPr>
-        <w:t xml:space="preserve">&lt;배포 폴더&gt;\                     ← 이 뷰어 (deploy_viewer.ps1 -Dest 로 복사한 곳)</w:t>
+        <w:t xml:space="preserve">&lt;deploy folder&gt;\                &lt;- this viewer (where deploy_viewer.ps1 -Dest copied it)</w:t>
       </w:r>
       <w:r>
         <w:br/>
@@ -2077,7 +2155,7 @@
         <w:rPr>
           <w:rStyle w:val="VerbatimChar"/>
         </w:rPr>
-        <w:t xml:space="preserve">├─ data\SMPL_MALE_clean.npz     ← SMPL 모델을 뷰어와 함께 둔 경우</w:t>
+        <w:t xml:space="preserve">├─ data\SMPL_MALE_clean.npz     &lt;- when the SMPL models are shipped with the viewer</w:t>
       </w:r>
       <w:r>
         <w:br/>
@@ -2184,7 +2262,7 @@
               <w:t xml:space="preserve"> </w:t>
             </w:r>
             <w:r>
-              <w:t xml:space="preserve">중요</w:t>
+              <w:t xml:space="preserve">Important</w:t>
             </w:r>
           </w:p>
         </w:tc>
@@ -2208,7 +2286,7 @@
               <w:spacing w:before="16" w:after="16"/>
             </w:pPr>
             <w:r>
-              <w:t xml:space="preserve">뷰어는 자기 옆의 폴더를 훑지 않는다. 번들을 보려면</w:t>
+              <w:t xml:space="preserve">The viewer does not scan the folders beside itself. To see bundles, set</w:t>
             </w:r>
             <w:r>
               <w:t xml:space="preserve"> </w:t>
@@ -2220,13 +2298,13 @@
               <w:t xml:space="preserve">SOMA_DATA_ROOT</w:t>
             </w:r>
             <w:r>
-              <w:t xml:space="preserve">를 설정하거나, 볼 폴더를</w:t>
+              <w:t xml:space="preserve">, or name</w:t>
             </w:r>
             <w:r>
               <w:t xml:space="preserve"> </w:t>
             </w:r>
             <w:r>
-              <w:t xml:space="preserve">직접 지정한다(아래 탐색 순서의 1).</w:t>
+              <w:t xml:space="preserve">the folder to look in (item 1 of the scan order below).</w:t>
             </w:r>
           </w:p>
           <w:p/>
@@ -2239,7 +2317,7 @@
         <w:ind w:firstLine="360"/>
       </w:pPr>
       <w:r>
-        <w:t xml:space="preserve">컬렉션에</w:t>
+        <w:t xml:space="preserve">When a collection ships an</w:t>
       </w:r>
       <w:r>
         <w:t xml:space="preserve"> </w:t>
@@ -2253,31 +2331,25 @@
         <w:t xml:space="preserve">INDEX.json</w:t>
       </w:r>
       <w:r>
-        <w:t xml:space="preserve">이 있으면 뷰어는 폴더를 일일이 뒤지지 않고 그 목록을 읽는다. run이 수천</w:t>
-      </w:r>
-      <w:r>
-        <w:t xml:space="preserve"> </w:t>
-      </w:r>
-      <w:r>
-        <w:t xml:space="preserve">개 있으면 폴더를 훑는 데는 수 분이 걸리지만(네트워크 드라이브에서는 더 오래) 목록 읽기는</w:t>
-      </w:r>
-      <w:r>
-        <w:t xml:space="preserve"> </w:t>
-      </w:r>
-      <w:r>
-        <w:t xml:space="preserve">순식간이다.</w:t>
-      </w:r>
-      <w:r>
-        <w:t xml:space="preserve"> </w:t>
-      </w:r>
-      <w:r>
-        <w:rPr>
-          <w:rStyle w:val="VerbatimChar"/>
-        </w:rPr>
-        <w:t xml:space="preserve">INDEX.json</w:t>
-      </w:r>
-      <w:r>
-        <w:t xml:space="preserve">이 없는 컬렉션은 예전처럼 폴더를 훑는다.</w:t>
+        <w:t xml:space="preserve">, the viewer reads that list instead of searching every</w:t>
+      </w:r>
+      <w:r>
+        <w:t xml:space="preserve"> </w:t>
+      </w:r>
+      <w:r>
+        <w:t xml:space="preserve">folder. With thousands of runs the difference is large — a folder walk takes minutes (longer on a network</w:t>
+      </w:r>
+      <w:r>
+        <w:t xml:space="preserve"> </w:t>
+      </w:r>
+      <w:r>
+        <w:t xml:space="preserve">drive), while reading the list is near-instant. Collections without one are searched folder by</w:t>
+      </w:r>
+      <w:r>
+        <w:t xml:space="preserve"> </w:t>
+      </w:r>
+      <w:r>
+        <w:t xml:space="preserve">folder as before.</w:t>
       </w:r>
     </w:p>
     <w:p>
@@ -2286,61 +2358,7 @@
         <w:ind w:firstLine="360"/>
       </w:pPr>
       <w:r>
-        <w:t xml:space="preserve">목록의 각 항목은 run 폴더 이름을</w:t>
-      </w:r>
-      <w:r>
-        <w:t xml:space="preserve"> </w:t>
-      </w:r>
-      <w:r>
-        <w:rPr>
-          <w:rStyle w:val="VerbatimChar"/>
-        </w:rPr>
-        <w:t xml:space="preserve">out_dir</w:t>
-      </w:r>
-      <w:r>
-        <w:t xml:space="preserve"> </w:t>
-      </w:r>
-      <w:r>
-        <w:t xml:space="preserve">·</w:t>
-      </w:r>
-      <w:r>
-        <w:t xml:space="preserve"> </w:t>
-      </w:r>
-      <w:r>
-        <w:rPr>
-          <w:rStyle w:val="VerbatimChar"/>
-        </w:rPr>
-        <w:t xml:space="preserve">relative_path</w:t>
-      </w:r>
-      <w:r>
-        <w:t xml:space="preserve"> </w:t>
-      </w:r>
-      <w:r>
-        <w:t xml:space="preserve">·</w:t>
-      </w:r>
-      <w:r>
-        <w:t xml:space="preserve"> </w:t>
-      </w:r>
-      <w:r>
-        <w:rPr>
-          <w:rStyle w:val="VerbatimChar"/>
-        </w:rPr>
-        <w:t xml:space="preserve">take</w:t>
-      </w:r>
-      <w:r>
-        <w:t xml:space="preserve"> </w:t>
-      </w:r>
-      <w:r>
-        <w:t xml:space="preserve">·</w:t>
-      </w:r>
-      <w:r>
-        <w:t xml:space="preserve"> </w:t>
-      </w:r>
-      <w:r>
-        <w:rPr>
-          <w:rStyle w:val="VerbatimChar"/>
-        </w:rPr>
-        <w:t xml:space="preserve">take_id</w:t>
+        <w:t xml:space="preserve">An entry may name its run folder in</w:t>
       </w:r>
       <w:r>
         <w:t xml:space="preserve"> </w:t>
@@ -2350,67 +2368,113 @@
           <w:b/>
           <w:bCs/>
         </w:rPr>
-        <w:t xml:space="preserve">중 아무</w:t>
+        <w:t xml:space="preserve">any</w:t>
+      </w:r>
+      <w:r>
+        <w:t xml:space="preserve"> </w:t>
+      </w:r>
+      <w:r>
+        <w:t xml:space="preserve">of</w:t>
+      </w:r>
+      <w:r>
+        <w:t xml:space="preserve"> </w:t>
+      </w:r>
+      <w:r>
+        <w:rPr>
+          <w:rStyle w:val="VerbatimChar"/>
+        </w:rPr>
+        <w:t xml:space="preserve">out_dir</w:t>
+      </w:r>
+      <w:r>
+        <w:t xml:space="preserve">,</w:t>
+      </w:r>
+      <w:r>
+        <w:t xml:space="preserve"> </w:t>
+      </w:r>
+      <w:r>
+        <w:rPr>
+          <w:rStyle w:val="VerbatimChar"/>
+        </w:rPr>
+        <w:t xml:space="preserve">relative_path</w:t>
+      </w:r>
+      <w:r>
+        <w:t xml:space="preserve">,</w:t>
+      </w:r>
+      <w:r>
+        <w:t xml:space="preserve"> </w:t>
+      </w:r>
+      <w:r>
+        <w:rPr>
+          <w:rStyle w:val="VerbatimChar"/>
+        </w:rPr>
+        <w:t xml:space="preserve">take</w:t>
+      </w:r>
+      <w:r>
+        <w:t xml:space="preserve"> </w:t>
+      </w:r>
+      <w:r>
+        <w:t xml:space="preserve">or</w:t>
+      </w:r>
+      <w:r>
+        <w:t xml:space="preserve"> </w:t>
+      </w:r>
+      <w:r>
+        <w:rPr>
+          <w:rStyle w:val="VerbatimChar"/>
+        </w:rPr>
+        <w:t xml:space="preserve">take_id</w:t>
+      </w:r>
+      <w:r>
+        <w:t xml:space="preserve">; all</w:t>
+      </w:r>
+      <w:r>
+        <w:t xml:space="preserve"> </w:t>
+      </w:r>
+      <w:r>
+        <w:t xml:space="preserve">four are read, so a catalog written by a different generator still works. If no entry names a folder,</w:t>
+      </w:r>
+      <w:r>
+        <w:t xml:space="preserve"> </w:t>
+      </w:r>
+      <w:r>
+        <w:t xml:space="preserve">the viewer says so on the console and falls back to searching. The runs found are the same either</w:t>
+      </w:r>
+      <w:r>
+        <w:t xml:space="preserve"> </w:t>
+      </w:r>
+      <w:r>
+        <w:t xml:space="preserve">way — only slower — so that line is the thing to check if filling the list suddenly takes minutes.</w:t>
+      </w:r>
+    </w:p>
+    <w:p>
+      <w:pPr>
+        <w:pStyle w:val="BodyText"/>
+        <w:ind w:firstLine="360"/>
+      </w:pPr>
+      <w:r>
+        <w:t xml:space="preserve">The viewer scans for run folders in this</w:t>
+      </w:r>
+      <w:r>
+        <w:t xml:space="preserve"> </w:t>
       </w:r>
       <w:r>
         <w:rPr>
           <w:b/>
           <w:bCs/>
         </w:rPr>
-        <w:t xml:space="preserve"> </w:t>
-      </w:r>
-      <w:r>
-        <w:rPr>
-          <w:b/>
-          <w:bCs/>
-        </w:rPr>
-        <w:t xml:space="preserve">필드로나</w:t>
-      </w:r>
-      <w:r>
-        <w:t xml:space="preserve"> </w:t>
-      </w:r>
-      <w:r>
-        <w:t xml:space="preserve">지정할 수 있다. 넷 다 읽으므로 생성기가 쓰는 이름이 달라도 그대로 동작한다. 어느 항목도</w:t>
-      </w:r>
-      <w:r>
-        <w:t xml:space="preserve"> </w:t>
-      </w:r>
-      <w:r>
-        <w:t xml:space="preserve">폴더를 지정하지 않으면 뷰어는 그 사실을 콘솔에 출력하고 폴더 훑기로 되돌아간다 — 결과는 같지만</w:t>
-      </w:r>
-      <w:r>
-        <w:t xml:space="preserve"> </w:t>
-      </w:r>
-      <w:r>
-        <w:t xml:space="preserve">느려지므로, 목록 채우기가 갑자기 느려졌다면 이 줄을 확인한다.</w:t>
-      </w:r>
-    </w:p>
-    <w:p>
-      <w:pPr>
-        <w:pStyle w:val="BodyText"/>
-        <w:ind w:firstLine="360"/>
-      </w:pPr>
-      <w:r>
-        <w:t xml:space="preserve">뷰어는 run 폴더를 다음</w:t>
-      </w:r>
-      <w:r>
-        <w:t xml:space="preserve"> </w:t>
-      </w:r>
-      <w:r>
-        <w:rPr>
-          <w:b/>
-          <w:bCs/>
-        </w:rPr>
-        <w:t xml:space="preserve">순서로 탐색</w:t>
-      </w:r>
-      <w:r>
-        <w:t xml:space="preserve">하며, 찾은 것을 모두 드롭다운에 모은다(같은 이름이면 먼저</w:t>
-      </w:r>
-      <w:r>
-        <w:t xml:space="preserve"> </w:t>
-      </w:r>
-      <w:r>
-        <w:t xml:space="preserve">찾은 것을 사용):</w:t>
+        <w:t xml:space="preserve">order</w:t>
+      </w:r>
+      <w:r>
+        <w:t xml:space="preserve"> </w:t>
+      </w:r>
+      <w:r>
+        <w:t xml:space="preserve">and pools everything it finds into the dropdown</w:t>
+      </w:r>
+      <w:r>
+        <w:t xml:space="preserve"> </w:t>
+      </w:r>
+      <w:r>
+        <w:t xml:space="preserve">(on a name clash the earlier root wins):</w:t>
       </w:r>
     </w:p>
     <w:p>
@@ -2422,19 +2486,22 @@
         </w:numPr>
       </w:pPr>
       <w:r>
-        <w:t xml:space="preserve">직접 지정한 폴더 — Blender 인자</w:t>
-      </w:r>
-      <w:r>
-        <w:t xml:space="preserve"> </w:t>
-      </w:r>
-      <w:r>
-        <w:rPr>
-          <w:rStyle w:val="VerbatimChar"/>
-        </w:rPr>
-        <w:t xml:space="preserve">-- --folder &lt;폴더&gt;</w:t>
-      </w:r>
-      <w:r>
-        <w:t xml:space="preserve">(여러 번 줄 수 있다) 또는 환경변수</w:t>
+        <w:t xml:space="preserve">a folder named explicitly — the Blender argument</w:t>
+      </w:r>
+      <w:r>
+        <w:t xml:space="preserve"> </w:t>
+      </w:r>
+      <w:r>
+        <w:rPr>
+          <w:rStyle w:val="VerbatimChar"/>
+        </w:rPr>
+        <w:t xml:space="preserve">-- --folder &lt;dir&gt;</w:t>
+      </w:r>
+      <w:r>
+        <w:t xml:space="preserve"> </w:t>
+      </w:r>
+      <w:r>
+        <w:t xml:space="preserve">(repeatable) or the</w:t>
       </w:r>
       <w:r>
         <w:t xml:space="preserve"> </w:t>
@@ -2444,6 +2511,12 @@
           <w:rStyle w:val="VerbatimChar"/>
         </w:rPr>
         <w:t xml:space="preserve">SOMA_VIEWER_DATASET</w:t>
+      </w:r>
+      <w:r>
+        <w:t xml:space="preserve"> </w:t>
+      </w:r>
+      <w:r>
+        <w:t xml:space="preserve">environment variable</w:t>
       </w:r>
     </w:p>
     <w:p>
@@ -2474,7 +2547,7 @@
           <w:b/>
           <w:bCs/>
         </w:rPr>
-        <w:t xml:space="preserve">이 PC의 번들 (기본 경로)</w:t>
+        <w:t xml:space="preserve">this PC’s bundles (the default)</w:t>
       </w:r>
     </w:p>
     <w:p>
@@ -2486,12 +2559,6 @@
         </w:numPr>
       </w:pPr>
       <w:r>
-        <w:t xml:space="preserve">뷰어 폴더 안의</w:t>
-      </w:r>
-      <w:r>
-        <w:t xml:space="preserve"> </w:t>
-      </w:r>
-      <w:r>
         <w:rPr>
           <w:rStyle w:val="VerbatimChar"/>
         </w:rPr>
@@ -2501,7 +2568,7 @@
         <w:t xml:space="preserve"> </w:t>
       </w:r>
       <w:r>
-        <w:t xml:space="preserve">(예비 사본용)</w:t>
+        <w:t xml:space="preserve">inside the viewer folder (for a fallback copy)</w:t>
       </w:r>
     </w:p>
     <w:p>
@@ -2510,19 +2577,28 @@
         <w:ind w:firstLine="360"/>
       </w:pPr>
       <w:r>
+        <w:t xml:space="preserve">With neither</w:t>
+      </w:r>
+      <w:r>
+        <w:t xml:space="preserve"> </w:t>
+      </w:r>
+      <w:r>
         <w:rPr>
           <w:rStyle w:val="VerbatimChar"/>
         </w:rPr>
         <w:t xml:space="preserve">SOMA_DATA_ROOT</w:t>
       </w:r>
       <w:r>
-        <w:t xml:space="preserve">도 없고 지정한 폴더도 없으면 뷰어는 무엇을 설정해야 하는지 콘솔에 적고 멈춘다.</w:t>
-      </w:r>
-      <w:r>
-        <w:t xml:space="preserve"> </w:t>
-      </w:r>
-      <w:r>
-        <w:t xml:space="preserve">SMPL 모델은 뷰어의</w:t>
+        <w:t xml:space="preserve"> </w:t>
+      </w:r>
+      <w:r>
+        <w:t xml:space="preserve">nor a named folder, the viewer says on the console what to set and</w:t>
+      </w:r>
+      <w:r>
+        <w:t xml:space="preserve"> </w:t>
+      </w:r>
+      <w:r>
+        <w:t xml:space="preserve">stops. SMPL models are looked for in the viewer’s</w:t>
       </w:r>
       <w:r>
         <w:t xml:space="preserve"> </w:t>
@@ -2534,7 +2610,7 @@
         <w:t xml:space="preserve">data\</w:t>
       </w:r>
       <w:r>
-        <w:t xml:space="preserve">, 그다음</w:t>
+        <w:t xml:space="preserve">, then</w:t>
       </w:r>
       <w:r>
         <w:t xml:space="preserve"> </w:t>
@@ -2546,7 +2622,7 @@
         <w:t xml:space="preserve">SOMA_BODY_MODEL_DIR</w:t>
       </w:r>
       <w:r>
-        <w:t xml:space="preserve">, 없으면</w:t>
+        <w:t xml:space="preserve">, else</w:t>
       </w:r>
       <w:r>
         <w:t xml:space="preserve"> </w:t>
@@ -2558,10 +2634,7 @@
         <w:t xml:space="preserve">SOMA_DATA_ROOT\body_models\smpl</w:t>
       </w:r>
       <w:r>
-        <w:t xml:space="preserve"> </w:t>
-      </w:r>
-      <w:r>
-        <w:t xml:space="preserve">에서 찾는다.</w:t>
+        <w:t xml:space="preserve">.</w:t>
       </w:r>
     </w:p>
     <w:p>
@@ -2574,10 +2647,10 @@
           <w:b/>
           <w:bCs/>
         </w:rPr>
-        <w:t xml:space="preserve">새 run 추가</w:t>
-      </w:r>
-      <w:r>
-        <w:t xml:space="preserve">:</w:t>
+        <w:t xml:space="preserve">Adding a run</w:t>
+      </w:r>
+      <w:r>
+        <w:t xml:space="preserve">: a bundle</w:t>
       </w:r>
       <w:r>
         <w:t xml:space="preserve"> </w:t>
@@ -2589,7 +2662,10 @@
         <w:t xml:space="preserve">soma-synth run</w:t>
       </w:r>
       <w:r>
-        <w:t xml:space="preserve">으로 번들을 만들면</w:t>
+        <w:t xml:space="preserve"> </w:t>
+      </w:r>
+      <w:r>
+        <w:t xml:space="preserve">makes lands under</w:t>
       </w:r>
       <w:r>
         <w:t xml:space="preserve"> </w:t>
@@ -2604,19 +2680,13 @@
         <w:t xml:space="preserve"> </w:t>
       </w:r>
       <w:r>
-        <w:t xml:space="preserve">아래에 생기고 다음 실행 때(또는</w:t>
-      </w:r>
-      <w:r>
-        <w:t xml:space="preserve"> </w:t>
-      </w:r>
-      <w:r>
-        <w:t xml:space="preserve">드롭다운을 열 때) 나타난다. 다른 곳의 run은 그 폴더를 1번 방법으로 지정한다.</w:t>
-      </w:r>
-      <w:r>
-        <w:t xml:space="preserve"> </w:t>
-      </w:r>
-      <w:r>
-        <w:t xml:space="preserve">run 폴더에는</w:t>
+        <w:t xml:space="preserve">and appears on the next</w:t>
+      </w:r>
+      <w:r>
+        <w:t xml:space="preserve"> </w:t>
+      </w:r>
+      <w:r>
+        <w:t xml:space="preserve">launch (or when the dropdown is opened). Runs elsewhere are shown by naming their folder as in item 1. A run folder needs</w:t>
       </w:r>
       <w:r>
         <w:t xml:space="preserve"> </w:t>
@@ -2640,7 +2710,34 @@
         <w:t xml:space="preserve">large_reference.npz</w:t>
       </w:r>
       <w:r>
-        <w:t xml:space="preserve">, 그리고 체형(</w:t>
+        <w:t xml:space="preserve">, and an</w:t>
+      </w:r>
+      <w:r>
+        <w:t xml:space="preserve"> </w:t>
+      </w:r>
+      <w:r>
+        <w:rPr>
+          <w:rStyle w:val="VerbatimChar"/>
+        </w:rPr>
+        <w:t xml:space="preserve">anthro_reference.npz</w:t>
+      </w:r>
+      <w:r>
+        <w:t xml:space="preserve"> </w:t>
+      </w:r>
+      <w:r>
+        <w:t xml:space="preserve">(older bundles:</w:t>
+      </w:r>
+      <w:r>
+        <w:t xml:space="preserve"> </w:t>
+      </w:r>
+      <w:r>
+        <w:rPr>
+          <w:rStyle w:val="VerbatimChar"/>
+        </w:rPr>
+        <w:t xml:space="preserve">development_reference.npz</w:t>
+      </w:r>
+      <w:r>
+        <w:t xml:space="preserve">) carrying the shape (</w:t>
       </w:r>
       <w:r>
         <w:rPr>
@@ -2649,7 +2746,10 @@
         <w:t xml:space="preserve">betas</w:t>
       </w:r>
       <w:r>
-        <w:t xml:space="preserve">·</w:t>
+        <w:t xml:space="preserve">,</w:t>
+      </w:r>
+      <w:r>
+        <w:t xml:space="preserve"> </w:t>
       </w:r>
       <w:r>
         <w:rPr>
@@ -2658,31 +2758,7 @@
         <w:t xml:space="preserve">gender</w:t>
       </w:r>
       <w:r>
-        <w:t xml:space="preserve">)을 담은</w:t>
-      </w:r>
-      <w:r>
-        <w:t xml:space="preserve"> </w:t>
-      </w:r>
-      <w:r>
-        <w:rPr>
-          <w:rStyle w:val="VerbatimChar"/>
-        </w:rPr>
-        <w:t xml:space="preserve">anthro_reference.npz</w:t>
-      </w:r>
-      <w:r>
-        <w:t xml:space="preserve">(구버전은</w:t>
-      </w:r>
-      <w:r>
-        <w:t xml:space="preserve"> </w:t>
-      </w:r>
-      <w:r>
-        <w:rPr>
-          <w:rStyle w:val="VerbatimChar"/>
-        </w:rPr>
-        <w:t xml:space="preserve">development_reference.npz</w:t>
-      </w:r>
-      <w:r>
-        <w:t xml:space="preserve">)가 있어야 한다.</w:t>
+        <w:t xml:space="preserve">).</w:t>
       </w:r>
     </w:p>
     <w:p>
@@ -2695,7 +2771,7 @@
           <w:b/>
           <w:bCs/>
         </w:rPr>
-        <w:t xml:space="preserve">체형은 피험자 성별에 맞는 모델로 그린다.</w:t>
+        <w:t xml:space="preserve">The body is drawn on the model matching the subject’s gender.</w:t>
       </w:r>
       <w:r>
         <w:t xml:space="preserve"> </w:t>
@@ -2707,13 +2783,22 @@
         <w:t xml:space="preserve">betas</w:t>
       </w:r>
       <w:r>
-        <w:t xml:space="preserve">는 자기 성별 모델의 형상 공간 값이라,</w:t>
-      </w:r>
-      <w:r>
-        <w:t xml:space="preserve"> </w:t>
-      </w:r>
-      <w:r>
-        <w:t xml:space="preserve">여성 피험자를 남성 모델에 얹으면 근사가 아니라</w:t>
+        <w:t xml:space="preserve"> </w:t>
+      </w:r>
+      <w:r>
+        <w:t xml:space="preserve">live in the shape space of</w:t>
+      </w:r>
+      <w:r>
+        <w:t xml:space="preserve"> </w:t>
+      </w:r>
+      <w:r>
+        <w:t xml:space="preserve">their own gendered model, so putting a woman’s betas on the male template does not approximate her</w:t>
+      </w:r>
+      <w:r>
+        <w:t xml:space="preserve"> </w:t>
+      </w:r>
+      <w:r>
+        <w:t xml:space="preserve">body — it draws</w:t>
       </w:r>
       <w:r>
         <w:t xml:space="preserve"> </w:t>
@@ -2723,16 +2808,13 @@
           <w:b/>
           <w:bCs/>
         </w:rPr>
-        <w:t xml:space="preserve">다른 사람의 몸</w:t>
-      </w:r>
-      <w:r>
-        <w:t xml:space="preserve">이 된다(실측 차이 약 23 cm).</w:t>
-      </w:r>
-      <w:r>
-        <w:t xml:space="preserve"> </w:t>
-      </w:r>
-      <w:r>
-        <w:t xml:space="preserve">뷰어는</w:t>
+        <w:t xml:space="preserve">a different one</w:t>
+      </w:r>
+      <w:r>
+        <w:t xml:space="preserve"> </w:t>
+      </w:r>
+      <w:r>
+        <w:t xml:space="preserve">(measured ~23 cm apart). The viewer reads</w:t>
       </w:r>
       <w:r>
         <w:t xml:space="preserve"> </w:t>
@@ -2744,7 +2826,10 @@
         <w:t xml:space="preserve">gender</w:t>
       </w:r>
       <w:r>
-        <w:t xml:space="preserve">를 읽어</w:t>
+        <w:t xml:space="preserve"> </w:t>
+      </w:r>
+      <w:r>
+        <w:t xml:space="preserve">and picks</w:t>
       </w:r>
       <w:r>
         <w:t xml:space="preserve"> </w:t>
@@ -2759,7 +2844,7 @@
         <w:t xml:space="preserve"> </w:t>
       </w:r>
       <w:r>
-        <w:t xml:space="preserve">/</w:t>
+        <w:t xml:space="preserve">or</w:t>
       </w:r>
       <w:r>
         <w:t xml:space="preserve"> </w:t>
@@ -2771,13 +2856,13 @@
         <w:t xml:space="preserve">SMPL_MALE_clean.npz</w:t>
       </w:r>
       <w:r>
-        <w:t xml:space="preserve">를 고른다. 해당 모델이</w:t>
-      </w:r>
-      <w:r>
-        <w:t xml:space="preserve"> </w:t>
-      </w:r>
-      <w:r>
-        <w:t xml:space="preserve">없는 배포본에서는 남성 모델로 대체하되</w:t>
+        <w:t xml:space="preserve">. A deployment carrying only one of them falls back</w:t>
+      </w:r>
+      <w:r>
+        <w:t xml:space="preserve"> </w:t>
+      </w:r>
+      <w:r>
+        <w:t xml:space="preserve">to it</w:t>
       </w:r>
       <w:r>
         <w:t xml:space="preserve"> </w:t>
@@ -2787,19 +2872,13 @@
           <w:b/>
           <w:bCs/>
         </w:rPr>
-        <w:t xml:space="preserve">콘솔에 그 사실을 출력한다</w:t>
-      </w:r>
-      <w:r>
-        <w:t xml:space="preserve"> </w:t>
-      </w:r>
-      <w:r>
-        <w:t xml:space="preserve">— 그때 화면의 체형은 그</w:t>
-      </w:r>
-      <w:r>
-        <w:t xml:space="preserve"> </w:t>
-      </w:r>
-      <w:r>
-        <w:t xml:space="preserve">피험자의 것이 아니다.</w:t>
+        <w:t xml:space="preserve">and says so on the console</w:t>
+      </w:r>
+      <w:r>
+        <w:t xml:space="preserve"> </w:t>
+      </w:r>
+      <w:r>
+        <w:t xml:space="preserve">— the shape on screen is then not that subject’s.</w:t>
       </w:r>
     </w:p>
     <w:p>
@@ -2808,7 +2887,7 @@
         <w:ind w:firstLine="360"/>
       </w:pPr>
       <w:r>
-        <w:t xml:space="preserve">관절</w:t>
+        <w:t xml:space="preserve">Datasets prefix the joint</w:t>
       </w:r>
       <w:r>
         <w:t xml:space="preserve"> </w:t>
@@ -2818,13 +2897,19 @@
           <w:b/>
           <w:bCs/>
         </w:rPr>
-        <w:t xml:space="preserve">회전</w:t>
-      </w:r>
-      <w:r>
-        <w:t xml:space="preserve"> </w:t>
-      </w:r>
-      <w:r>
-        <w:t xml:space="preserve">배열은 데이터셋마다 이름 앞에 출처를 붙인다(</w:t>
+        <w:t xml:space="preserve">rotation</w:t>
+      </w:r>
+      <w:r>
+        <w:t xml:space="preserve"> </w:t>
+      </w:r>
+      <w:r>
+        <w:t xml:space="preserve">array with their own source name</w:t>
+      </w:r>
+      <w:r>
+        <w:t xml:space="preserve"> </w:t>
+      </w:r>
+      <w:r>
+        <w:t xml:space="preserve">(</w:t>
       </w:r>
       <w:r>
         <w:rPr>
@@ -2845,10 +2930,28 @@
         <w:t xml:space="preserve">smpl_global_orientation_world</w:t>
       </w:r>
       <w:r>
-        <w:t xml:space="preserve"> </w:t>
-      </w:r>
-      <w:r>
-        <w:t xml:space="preserve">등). 뷰어는 이름을 하나로 못박지 않고</w:t>
+        <w:t xml:space="preserve">, …). The viewer does not</w:t>
+      </w:r>
+      <w:r>
+        <w:t xml:space="preserve"> </w:t>
+      </w:r>
+      <w:r>
+        <w:t xml:space="preserve">hard-code one name: it takes any</w:t>
+      </w:r>
+      <w:r>
+        <w:t xml:space="preserve"> </w:t>
+      </w:r>
+      <w:r>
+        <w:rPr>
+          <w:rStyle w:val="VerbatimChar"/>
+        </w:rPr>
+        <w:t xml:space="preserve">[T,24,4]</w:t>
+      </w:r>
+      <w:r>
+        <w:t xml:space="preserve"> </w:t>
+      </w:r>
+      <w:r>
+        <w:t xml:space="preserve">array starting with</w:t>
       </w:r>
       <w:r>
         <w:t xml:space="preserve"> </w:t>
@@ -2860,28 +2963,7 @@
         <w:t xml:space="preserve">smpl_global_orientation</w:t>
       </w:r>
       <w:r>
-        <w:t xml:space="preserve">으로</w:t>
-      </w:r>
-      <w:r>
-        <w:t xml:space="preserve"> </w:t>
-      </w:r>
-      <w:r>
-        <w:t xml:space="preserve">시작하는</w:t>
-      </w:r>
-      <w:r>
-        <w:t xml:space="preserve"> </w:t>
-      </w:r>
-      <w:r>
-        <w:rPr>
-          <w:rStyle w:val="VerbatimChar"/>
-        </w:rPr>
-        <w:t xml:space="preserve">[T,24,4]</w:t>
-      </w:r>
-      <w:r>
-        <w:t xml:space="preserve"> </w:t>
-      </w:r>
-      <w:r>
-        <w:t xml:space="preserve">배열을 찾으므로,</w:t>
+        <w:t xml:space="preserve">, so</w:t>
       </w:r>
       <w:r>
         <w:t xml:space="preserve"> </w:t>
@@ -2891,13 +2973,24 @@
           <w:b/>
           <w:bCs/>
         </w:rPr>
-        <w:t xml:space="preserve">규약을 따르는 다른 데이터셋도 코드 수정 없이</w:t>
-      </w:r>
-      <w:r>
-        <w:t xml:space="preserve"> </w:t>
-      </w:r>
-      <w:r>
-        <w:t xml:space="preserve">열린다.</w:t>
+        <w:t xml:space="preserve">any</w:t>
+      </w:r>
+      <w:r>
+        <w:rPr>
+          <w:b/>
+          <w:bCs/>
+        </w:rPr>
+        <w:t xml:space="preserve"> </w:t>
+      </w:r>
+      <w:r>
+        <w:rPr>
+          <w:b/>
+          <w:bCs/>
+        </w:rPr>
+        <w:t xml:space="preserve">dataset following the contract opens without a code change</w:t>
+      </w:r>
+      <w:r>
+        <w:t xml:space="preserve">.</w:t>
       </w:r>
     </w:p>
     <w:p>
@@ -2906,7 +2999,7 @@
         <w:ind w:firstLine="360"/>
       </w:pPr>
       <w:r>
-        <w:t xml:space="preserve">또</w:t>
+        <w:t xml:space="preserve">It also needs a</w:t>
       </w:r>
       <w:r>
         <w:t xml:space="preserve"> </w:t>
@@ -2916,10 +3009,19 @@
           <w:b/>
           <w:bCs/>
         </w:rPr>
-        <w:t xml:space="preserve">루트 이동값</w:t>
-      </w:r>
-      <w:r>
-        <w:t xml:space="preserve">(몸이 공간에서 움직이는 궤적)을 다음 순서로 찾는다:</w:t>
+        <w:t xml:space="preserve">root translation</w:t>
+      </w:r>
+      <w:r>
+        <w:t xml:space="preserve"> </w:t>
+      </w:r>
+      <w:r>
+        <w:t xml:space="preserve">— the trajectory the body follows through the world — and looks</w:t>
+      </w:r>
+      <w:r>
+        <w:t xml:space="preserve"> </w:t>
+      </w:r>
+      <w:r>
+        <w:t xml:space="preserve">for it in this order:</w:t>
       </w:r>
     </w:p>
     <w:p>
@@ -2934,19 +3036,22 @@
         <w:rPr>
           <w:rStyle w:val="VerbatimChar"/>
         </w:rPr>
+        <w:t xml:space="preserve">smpl_trans</w:t>
+      </w:r>
+      <w:r>
+        <w:t xml:space="preserve"> </w:t>
+      </w:r>
+      <w:r>
+        <w:t xml:space="preserve">in</w:t>
+      </w:r>
+      <w:r>
+        <w:t xml:space="preserve"> </w:t>
+      </w:r>
+      <w:r>
+        <w:rPr>
+          <w:rStyle w:val="VerbatimChar"/>
+        </w:rPr>
         <w:t xml:space="preserve">anthro_reference.npz</w:t>
-      </w:r>
-      <w:r>
-        <w:t xml:space="preserve">의</w:t>
-      </w:r>
-      <w:r>
-        <w:t xml:space="preserve"> </w:t>
-      </w:r>
-      <w:r>
-        <w:rPr>
-          <w:rStyle w:val="VerbatimChar"/>
-        </w:rPr>
-        <w:t xml:space="preserve">smpl_trans</w:t>
       </w:r>
     </w:p>
     <w:p>
@@ -2961,25 +3066,28 @@
         <w:rPr>
           <w:rStyle w:val="VerbatimChar"/>
         </w:rPr>
+        <w:t xml:space="preserve">smpl_trans</w:t>
+      </w:r>
+      <w:r>
+        <w:t xml:space="preserve"> </w:t>
+      </w:r>
+      <w:r>
+        <w:t xml:space="preserve">in</w:t>
+      </w:r>
+      <w:r>
+        <w:t xml:space="preserve"> </w:t>
+      </w:r>
+      <w:r>
+        <w:rPr>
+          <w:rStyle w:val="VerbatimChar"/>
+        </w:rPr>
         <w:t xml:space="preserve">large_reference.npz</w:t>
       </w:r>
       <w:r>
-        <w:t xml:space="preserve">의</w:t>
-      </w:r>
-      <w:r>
-        <w:t xml:space="preserve"> </w:t>
-      </w:r>
-      <w:r>
-        <w:rPr>
-          <w:rStyle w:val="VerbatimChar"/>
-        </w:rPr>
-        <w:t xml:space="preserve">smpl_trans</w:t>
-      </w:r>
-      <w:r>
-        <w:t xml:space="preserve"> </w:t>
-      </w:r>
-      <w:r>
-        <w:t xml:space="preserve">— 게시될 경우의 정식 위치</w:t>
+        <w:t xml:space="preserve"> </w:t>
+      </w:r>
+      <w:r>
+        <w:t xml:space="preserve">— the canonical home once it is published there</w:t>
       </w:r>
     </w:p>
     <w:p>
@@ -2997,10 +3105,7 @@
         <w:t xml:space="preserve">smpl_root_translation.npz</w:t>
       </w:r>
       <w:r>
-        <w:t xml:space="preserve"> </w:t>
-      </w:r>
-      <w:r>
-        <w:t xml:space="preserve">(원본에서 복원한 보조 파일)</w:t>
+        <w:t xml:space="preserve">, a companion file recovered from the source recording</w:t>
       </w:r>
     </w:p>
     <w:p>
@@ -3012,7 +3117,16 @@
         </w:numPr>
       </w:pPr>
       <w:r>
-        <w:t xml:space="preserve">같은 폴더의</w:t>
+        <w:rPr>
+          <w:rStyle w:val="VerbatimChar"/>
+        </w:rPr>
+        <w:t xml:space="preserve">trans</w:t>
+      </w:r>
+      <w:r>
+        <w:t xml:space="preserve"> </w:t>
+      </w:r>
+      <w:r>
+        <w:t xml:space="preserve">in a</w:t>
       </w:r>
       <w:r>
         <w:t xml:space="preserve"> </w:t>
@@ -3024,16 +3138,10 @@
         <w:t xml:space="preserve">*_smplx.npz</w:t>
       </w:r>
       <w:r>
-        <w:t xml:space="preserve">의</w:t>
-      </w:r>
-      <w:r>
-        <w:t xml:space="preserve"> </w:t>
-      </w:r>
-      <w:r>
-        <w:rPr>
-          <w:rStyle w:val="VerbatimChar"/>
-        </w:rPr>
-        <w:t xml:space="preserve">trans</w:t>
+        <w:t xml:space="preserve"> </w:t>
+      </w:r>
+      <w:r>
+        <w:t xml:space="preserve">in the same folder</w:t>
       </w:r>
     </w:p>
     <w:p>
@@ -3049,13 +3157,16 @@
           <w:b/>
           <w:bCs/>
         </w:rPr>
-        <w:t xml:space="preserve">없으면 «제자리»로 재생</w:t>
-      </w:r>
-      <w:r>
-        <w:t xml:space="preserve"> </w:t>
-      </w:r>
-      <w:r>
-        <w:t xml:space="preserve">— 자세와 IMU 축은 정확하지만 공간 이동만 빠진다</w:t>
+        <w:t xml:space="preserve">none of them → the take plays in place</w:t>
+      </w:r>
+      <w:r>
+        <w:t xml:space="preserve">: pose and IMU frames are still exact, only the travel</w:t>
+      </w:r>
+      <w:r>
+        <w:t xml:space="preserve"> </w:t>
+      </w:r>
+      <w:r>
+        <w:t xml:space="preserve">through the world is missing</w:t>
       </w:r>
     </w:p>
     <w:p>
@@ -3064,7 +3175,7 @@
         <w:ind w:firstLine="360"/>
       </w:pPr>
       <w:r>
-        <w:t xml:space="preserve">5번일 때는 패널에</w:t>
+        <w:t xml:space="preserve">In case 5 the panel shows</w:t>
       </w:r>
       <w:r>
         <w:t xml:space="preserve"> </w:t>
@@ -3077,16 +3188,7 @@
         <w:t xml:space="preserve">“no root translation — playing in place”</w:t>
       </w:r>
       <w:r>
-        <w:t xml:space="preserve"> </w:t>
-      </w:r>
-      <w:r>
-        <w:t xml:space="preserve">경고가 표시된다. 조용히 넘어가지</w:t>
-      </w:r>
-      <w:r>
-        <w:t xml:space="preserve"> </w:t>
-      </w:r>
-      <w:r>
-        <w:t xml:space="preserve">않는다.</w:t>
+        <w:t xml:space="preserve">. It is never silent.</w:t>
       </w:r>
     </w:p>
     <w:tbl>
@@ -3175,7 +3277,7 @@
               <w:t xml:space="preserve"> </w:t>
             </w:r>
             <w:r>
-              <w:t xml:space="preserve">경고</w:t>
+              <w:t xml:space="preserve">Warning</w:t>
             </w:r>
           </w:p>
         </w:tc>
@@ -3199,13 +3301,23 @@
               <w:spacing w:before="16" w:after="16"/>
             </w:pPr>
             <w:r>
+              <w:t xml:space="preserve">Do</w:t>
+            </w:r>
+            <w:r>
+              <w:t xml:space="preserve"> </w:t>
+            </w:r>
+            <w:r>
               <w:rPr>
-                <w:rStyle w:val="VerbatimChar"/>
+                <w:b/>
+                <w:bCs/>
               </w:rPr>
-              <w:t xml:space="preserve">large_reference.npz</w:t>
-            </w:r>
-            <w:r>
-              <w:t xml:space="preserve">의</w:t>
+              <w:t xml:space="preserve">not</w:t>
+            </w:r>
+            <w:r>
+              <w:t xml:space="preserve"> </w:t>
+            </w:r>
+            <w:r>
+              <w:t xml:space="preserve">assume</w:t>
             </w:r>
             <w:r>
               <w:t xml:space="preserve"> </w:t>
@@ -3217,7 +3329,16 @@
               <w:t xml:space="preserve">pelvis_position_world_aux</w:t>
             </w:r>
             <w:r>
-              <w:t xml:space="preserve">를 이동값으로</w:t>
+              <w:t xml:space="preserve"> </w:t>
+            </w:r>
+            <w:r>
+              <w:t xml:space="preserve">is the translation. In AMASS bundles it happens to equal</w:t>
+            </w:r>
+            <w:r>
+              <w:t xml:space="preserve"> </w:t>
+            </w:r>
+            <w:r>
+              <w:t xml:space="preserve">it; in PRISM ones it is the pelvis</w:t>
             </w:r>
             <w:r>
               <w:t xml:space="preserve"> </w:t>
@@ -3227,38 +3348,19 @@
                 <w:b/>
                 <w:bCs/>
               </w:rPr>
-              <w:t xml:space="preserve">가정하면 안 된다</w:t>
-            </w:r>
-            <w:r>
-              <w:t xml:space="preserve">. AMASS</w:t>
+              <w:t xml:space="preserve">marker</w:t>
             </w:r>
             <w:r>
               <w:t xml:space="preserve"> </w:t>
             </w:r>
             <w:r>
-              <w:t xml:space="preserve">번들에서는 이 값이 루트 이동값과 같지만, PRISM에서는 골반</w:t>
+              <w:t xml:space="preserve">and drifts from the SMPL root by up to ~0.1 m over time.</w:t>
             </w:r>
             <w:r>
               <w:t xml:space="preserve"> </w:t>
             </w:r>
             <w:r>
-              <w:rPr>
-                <w:b/>
-                <w:bCs/>
-              </w:rPr>
-              <w:t xml:space="preserve">마커</w:t>
-            </w:r>
-            <w:r>
-              <w:t xml:space="preserve"> </w:t>
-            </w:r>
-            <w:r>
-              <w:t xml:space="preserve">위치라 시간에 따라 최대 약</w:t>
-            </w:r>
-            <w:r>
-              <w:t xml:space="preserve"> </w:t>
-            </w:r>
-            <w:r>
-              <w:t xml:space="preserve">0.1 m 어긋난다. 같은 이름이 데이터셋마다 다른 뜻이므로, 데이터셋별 판단은</w:t>
+              <w:t xml:space="preserve">The same field name means different things per dataset, so</w:t>
             </w:r>
             <w:r>
               <w:t xml:space="preserve"> </w:t>
@@ -3270,7 +3372,16 @@
               <w:t xml:space="preserve">scripts/poc/enrich_root_translation.py</w:t>
             </w:r>
             <w:r>
-              <w:t xml:space="preserve">가 원본을 확인해 3번 보조 파일로 만들어 둔다.</w:t>
+              <w:t xml:space="preserve"> </w:t>
+            </w:r>
+            <w:r>
+              <w:t xml:space="preserve">settles it against each run’s source recording and writes</w:t>
+            </w:r>
+            <w:r>
+              <w:t xml:space="preserve"> </w:t>
+            </w:r>
+            <w:r>
+              <w:t xml:space="preserve">the companion file in step 3.</w:t>
             </w:r>
           </w:p>
           <w:p/>
@@ -3371,7 +3482,7 @@
               <w:t xml:space="preserve"> </w:t>
             </w:r>
             <w:r>
-              <w:t xml:space="preserve">노트</w:t>
+              <w:t xml:space="preserve">Note</w:t>
             </w:r>
           </w:p>
         </w:tc>
@@ -3395,13 +3506,13 @@
               <w:spacing w:before="16" w:after="16"/>
             </w:pPr>
             <w:r>
-              <w:t xml:space="preserve">긴 take는 로드가 오래 걸린다. 10초(1,000프레임)짜리는 몇 초, 2분(13,000프레임)짜리는 1분 정도</w:t>
+              <w:t xml:space="preserve">Long takes take longer to load: a 10 s take (1,000 frames) is a few seconds, a 2 min take (13,000</w:t>
             </w:r>
             <w:r>
               <w:t xml:space="preserve"> </w:t>
             </w:r>
             <w:r>
-              <w:t xml:space="preserve">걸린 뒤 재생이 시작된다. 프레임 수에 대체로 비례한다.</w:t>
+              <w:t xml:space="preserve">frames) about a minute before playback starts, roughly in proportion to the frame count.</w:t>
             </w:r>
           </w:p>
           <w:p/>
@@ -3409,13 +3520,13 @@
       </w:tr>
     </w:tbl>
     <w:bookmarkEnd w:id="940"/>
-    <w:bookmarkStart w:id="941" w:name="라이선스-배포-주의"/>
+    <w:bookmarkStart w:id="941" w:name="license-and-distribution-notice"/>
     <w:p>
       <w:pPr>
         <w:pStyle w:val="Heading1"/>
       </w:pPr>
       <w:r>
-        <w:t xml:space="preserve">6. 라이선스 · 배포 주의</w:t>
+        <w:t xml:space="preserve">6. License and distribution notice</w:t>
       </w:r>
     </w:p>
     <w:p>
@@ -3427,7 +3538,7 @@
         </w:numPr>
       </w:pPr>
       <w:r>
-        <w:t xml:space="preserve">이 뷰어의 인체는</w:t>
+        <w:t xml:space="preserve">The body in this viewer is derived from the</w:t>
       </w:r>
       <w:r>
         <w:t xml:space="preserve"> </w:t>
@@ -3440,7 +3551,10 @@
         <w:t xml:space="preserve">MPI SMPL body model</w:t>
       </w:r>
       <w:r>
-        <w:t xml:space="preserve">(비상업 연구용,</w:t>
+        <w:t xml:space="preserve"> </w:t>
+      </w:r>
+      <w:r>
+        <w:t xml:space="preserve">(non-commercial research use,</w:t>
       </w:r>
       <w:r>
         <w:t xml:space="preserve"> </w:t>
@@ -3450,16 +3564,10 @@
           <w:b/>
           <w:bCs/>
         </w:rPr>
-        <w:t xml:space="preserve">재배포 금지</w:t>
-      </w:r>
-      <w:r>
-        <w:t xml:space="preserve">)에서 파생된 결과물이다.</w:t>
-      </w:r>
-      <w:r>
-        <w:t xml:space="preserve"> </w:t>
-      </w:r>
-      <w:r>
-        <w:t xml:space="preserve">외부·공개 배포는 금지되며,</w:t>
+        <w:t xml:space="preserve">redistribution prohibited</w:t>
+      </w:r>
+      <w:r>
+        <w:t xml:space="preserve">). Public or external distribution is forbidden; use it only on</w:t>
       </w:r>
       <w:r>
         <w:t xml:space="preserve"> </w:t>
@@ -3469,10 +3577,7 @@
           <w:b/>
           <w:bCs/>
         </w:rPr>
-        <w:t xml:space="preserve">같은 연구 라이선스를 보유한 본인/연구실 내부 컴퓨터</w:t>
-      </w:r>
-      <w:r>
-        <w:t xml:space="preserve">에서만 사용한다</w:t>
+        <w:t xml:space="preserve">internal computers held by license-holders in your lab</w:t>
       </w:r>
       <w:r>
         <w:t xml:space="preserve"> </w:t>
@@ -3490,7 +3595,7 @@
         </w:numPr>
       </w:pPr>
       <w:r>
-        <w:t xml:space="preserve">Blender는 GPL 라이선스로 재배포가 허용된다.</w:t>
+        <w:t xml:space="preserve">Blender is GPL-licensed and may be redistributed.</w:t>
       </w:r>
     </w:p>
     <w:p>
@@ -3502,7 +3607,7 @@
         </w:numPr>
       </w:pPr>
       <w:r>
-        <w:t xml:space="preserve">폴더 전체를 복사해 다른</w:t>
+        <w:t xml:space="preserve">You may copy the whole folder to another</w:t>
       </w:r>
       <w:r>
         <w:t xml:space="preserve"> </w:t>
@@ -3512,13 +3617,13 @@
           <w:b/>
           <w:bCs/>
         </w:rPr>
-        <w:t xml:space="preserve">내부</w:t>
-      </w:r>
-      <w:r>
-        <w:t xml:space="preserve"> </w:t>
-      </w:r>
-      <w:r>
-        <w:t xml:space="preserve">Windows PC로 옮겨 실행할 수 있다.</w:t>
+        <w:t xml:space="preserve">internal</w:t>
+      </w:r>
+      <w:r>
+        <w:t xml:space="preserve"> </w:t>
+      </w:r>
+      <w:r>
+        <w:t xml:space="preserve">Windows PC and run it there.</w:t>
       </w:r>
     </w:p>
     <w:bookmarkEnd w:id="941"/>
@@ -4038,7 +4143,7 @@
         <w:rFonts w:asciiTheme="minorHAnsi" w:cstheme="minorBidi" w:eastAsiaTheme="minorHAnsi" w:hAnsiTheme="minorHAnsi"/>
         <w:sz w:val="20"/>
         <w:szCs w:val="20"/>
-        <w:lang w:bidi="ar-SA" w:eastAsia="ko" w:val="en-US"/>
+        <w:lang w:bidi="ar-SA" w:eastAsia="en-US" w:val="en"/>
       </w:rPr>
     </w:rPrDefault>
     <w:pPrDefault>

</xml_diff>